<commit_message>
Add presentation and test report for phase 3; update SQL scripts for CDC process
</commit_message>
<xml_diff>
--- a/inleveren fase 3/beroepsproducten/Testverslag.docx
+++ b/inleveren fase 3/beroepsproducten/Testverslag.docx
@@ -154,14 +154,14 @@
                         </a:ln>
                         <a:extLst>
                           <a:ext uri="{909E8E84-426E-40dd-AFC4-6F175D3DCCD1}">
-                            <a14:hiddenFill xmlns:pic="http://schemas.openxmlformats.org/drawingml/2006/picture" xmlns:arto="http://schemas.microsoft.com/office/word/2006/arto" xmlns="" xmlns:mo="http://schemas.microsoft.com/office/mac/office/2008/main" xmlns:mv="urn:schemas-microsoft-com:mac:vml" xmlns:o="urn:schemas-microsoft-com:office:office" xmlns:v="urn:schemas-microsoft-com:vml" xmlns:w10="urn:schemas-microsoft-com:office:word" xmlns:w="http://schemas.openxmlformats.org/wordprocessingml/2006/main" xmlns:a14="http://schemas.microsoft.com/office/drawing/2010/main">
+                            <a14:hiddenFill xmlns:a14="http://schemas.microsoft.com/office/drawing/2010/main" xmlns:w="http://schemas.openxmlformats.org/wordprocessingml/2006/main" xmlns:w10="urn:schemas-microsoft-com:office:word" xmlns:v="urn:schemas-microsoft-com:vml" xmlns:o="urn:schemas-microsoft-com:office:office" xmlns:mv="urn:schemas-microsoft-com:mac:vml" xmlns:mo="http://schemas.microsoft.com/office/mac/office/2008/main" xmlns="" xmlns:arto="http://schemas.microsoft.com/office/word/2006/arto" xmlns:pic="http://schemas.openxmlformats.org/drawingml/2006/picture">
                               <a:solidFill>
                                 <a:srgbClr val="FFFFFF"/>
                               </a:solidFill>
                             </a14:hiddenFill>
                           </a:ext>
                           <a:ext uri="{91240B29-F687-4f45-9708-019B960494DF}">
-                            <a14:hiddenLine xmlns:pic="http://schemas.openxmlformats.org/drawingml/2006/picture" xmlns:arto="http://schemas.microsoft.com/office/word/2006/arto" xmlns="" xmlns:mo="http://schemas.microsoft.com/office/mac/office/2008/main" xmlns:mv="urn:schemas-microsoft-com:mac:vml" xmlns:o="urn:schemas-microsoft-com:office:office" xmlns:v="urn:schemas-microsoft-com:vml" xmlns:w10="urn:schemas-microsoft-com:office:word" xmlns:w="http://schemas.openxmlformats.org/wordprocessingml/2006/main" xmlns:a14="http://schemas.microsoft.com/office/drawing/2010/main" w="9525">
+                            <a14:hiddenLine xmlns:a14="http://schemas.microsoft.com/office/drawing/2010/main" xmlns:w="http://schemas.openxmlformats.org/wordprocessingml/2006/main" xmlns:w10="urn:schemas-microsoft-com:office:word" xmlns:v="urn:schemas-microsoft-com:vml" xmlns:o="urn:schemas-microsoft-com:office:office" xmlns:mv="urn:schemas-microsoft-com:mac:vml" xmlns:mo="http://schemas.microsoft.com/office/mac/office/2008/main" xmlns="" xmlns:arto="http://schemas.microsoft.com/office/word/2006/arto" xmlns:pic="http://schemas.openxmlformats.org/drawingml/2006/picture" w="9525">
                               <a:solidFill>
                                 <a:srgbClr val="000000"/>
                               </a:solidFill>
@@ -348,14 +348,14 @@
                         </a:ln>
                         <a:extLst>
                           <a:ext uri="{909E8E84-426E-40dd-AFC4-6F175D3DCCD1}">
-                            <a14:hiddenFill xmlns:pic="http://schemas.openxmlformats.org/drawingml/2006/picture" xmlns:arto="http://schemas.microsoft.com/office/word/2006/arto" xmlns="" xmlns:mo="http://schemas.microsoft.com/office/mac/office/2008/main" xmlns:mv="urn:schemas-microsoft-com:mac:vml" xmlns:o="urn:schemas-microsoft-com:office:office" xmlns:v="urn:schemas-microsoft-com:vml" xmlns:w10="urn:schemas-microsoft-com:office:word" xmlns:w="http://schemas.openxmlformats.org/wordprocessingml/2006/main" xmlns:a14="http://schemas.microsoft.com/office/drawing/2010/main">
+                            <a14:hiddenFill xmlns:a14="http://schemas.microsoft.com/office/drawing/2010/main" xmlns:w="http://schemas.openxmlformats.org/wordprocessingml/2006/main" xmlns:w10="urn:schemas-microsoft-com:office:word" xmlns:v="urn:schemas-microsoft-com:vml" xmlns:o="urn:schemas-microsoft-com:office:office" xmlns:mv="urn:schemas-microsoft-com:mac:vml" xmlns:mo="http://schemas.microsoft.com/office/mac/office/2008/main" xmlns="" xmlns:arto="http://schemas.microsoft.com/office/word/2006/arto" xmlns:pic="http://schemas.openxmlformats.org/drawingml/2006/picture">
                               <a:solidFill>
                                 <a:srgbClr val="FFFFFF"/>
                               </a:solidFill>
                             </a14:hiddenFill>
                           </a:ext>
                           <a:ext uri="{91240B29-F687-4f45-9708-019B960494DF}">
-                            <a14:hiddenLine xmlns:pic="http://schemas.openxmlformats.org/drawingml/2006/picture" xmlns:arto="http://schemas.microsoft.com/office/word/2006/arto" xmlns="" xmlns:mo="http://schemas.microsoft.com/office/mac/office/2008/main" xmlns:mv="urn:schemas-microsoft-com:mac:vml" xmlns:o="urn:schemas-microsoft-com:office:office" xmlns:v="urn:schemas-microsoft-com:vml" xmlns:w10="urn:schemas-microsoft-com:office:word" xmlns:w="http://schemas.openxmlformats.org/wordprocessingml/2006/main" xmlns:a14="http://schemas.microsoft.com/office/drawing/2010/main" w="9525">
+                            <a14:hiddenLine xmlns:a14="http://schemas.microsoft.com/office/drawing/2010/main" xmlns:w="http://schemas.openxmlformats.org/wordprocessingml/2006/main" xmlns:w10="urn:schemas-microsoft-com:office:word" xmlns:v="urn:schemas-microsoft-com:vml" xmlns:o="urn:schemas-microsoft-com:office:office" xmlns:mv="urn:schemas-microsoft-com:mac:vml" xmlns:mo="http://schemas.microsoft.com/office/mac/office/2008/main" xmlns="" xmlns:arto="http://schemas.microsoft.com/office/word/2006/arto" xmlns:pic="http://schemas.openxmlformats.org/drawingml/2006/picture" w="9525">
                               <a:solidFill>
                                 <a:srgbClr val="000000"/>
                               </a:solidFill>
@@ -604,7 +604,7 @@
               <w:kern w:val="2"/>
               <w:sz w:val="24"/>
               <w:szCs w:val="24"/>
-              <w:lang w:val="en-NL" w:eastAsia="en-NL"/>
+              <w:lang w:val="nl-NL" w:eastAsia="en-NL"/>
               <w14:ligatures w14:val="standardContextual"/>
             </w:rPr>
           </w:pPr>
@@ -646,41 +646,48 @@
             <w:r>
               <w:rPr>
                 <w:webHidden/>
+                <w:lang w:val="nl-NL"/>
               </w:rPr>
               <w:tab/>
             </w:r>
             <w:r>
               <w:rPr>
                 <w:webHidden/>
+                <w:lang w:val="nl-NL"/>
               </w:rPr>
               <w:fldChar w:fldCharType="begin"/>
             </w:r>
             <w:r>
               <w:rPr>
                 <w:webHidden/>
+                <w:lang w:val="nl-NL"/>
               </w:rPr>
               <w:instrText xml:space="preserve"> PAGEREF _Toc225342849 \h </w:instrText>
             </w:r>
             <w:r>
               <w:rPr>
                 <w:webHidden/>
-              </w:rPr>
-            </w:r>
-            <w:r>
-              <w:rPr>
-                <w:webHidden/>
+                <w:lang w:val="nl-NL"/>
+              </w:rPr>
+            </w:r>
+            <w:r>
+              <w:rPr>
+                <w:webHidden/>
+                <w:lang w:val="nl-NL"/>
               </w:rPr>
               <w:fldChar w:fldCharType="separate"/>
             </w:r>
             <w:r>
               <w:rPr>
                 <w:webHidden/>
+                <w:lang w:val="nl-NL"/>
               </w:rPr>
               <w:t>2</w:t>
             </w:r>
             <w:r>
               <w:rPr>
                 <w:webHidden/>
+                <w:lang w:val="nl-NL"/>
               </w:rPr>
               <w:fldChar w:fldCharType="end"/>
             </w:r>
@@ -694,7 +701,7 @@
               <w:kern w:val="2"/>
               <w:sz w:val="24"/>
               <w:szCs w:val="24"/>
-              <w:lang w:val="en-NL" w:eastAsia="en-NL"/>
+              <w:lang w:val="nl-NL" w:eastAsia="en-NL"/>
               <w14:ligatures w14:val="standardContextual"/>
             </w:rPr>
           </w:pPr>
@@ -712,7 +719,7 @@
                 <w:kern w:val="2"/>
                 <w:sz w:val="24"/>
                 <w:szCs w:val="24"/>
-                <w:lang w:val="en-NL" w:eastAsia="en-NL"/>
+                <w:lang w:val="nl-NL" w:eastAsia="en-NL"/>
                 <w14:ligatures w14:val="standardContextual"/>
               </w:rPr>
               <w:tab/>
@@ -727,41 +734,48 @@
             <w:r>
               <w:rPr>
                 <w:webHidden/>
+                <w:lang w:val="nl-NL"/>
               </w:rPr>
               <w:tab/>
             </w:r>
             <w:r>
               <w:rPr>
                 <w:webHidden/>
+                <w:lang w:val="nl-NL"/>
               </w:rPr>
               <w:fldChar w:fldCharType="begin"/>
             </w:r>
             <w:r>
               <w:rPr>
                 <w:webHidden/>
+                <w:lang w:val="nl-NL"/>
               </w:rPr>
               <w:instrText xml:space="preserve"> PAGEREF _Toc225342850 \h </w:instrText>
             </w:r>
             <w:r>
               <w:rPr>
                 <w:webHidden/>
-              </w:rPr>
-            </w:r>
-            <w:r>
-              <w:rPr>
-                <w:webHidden/>
+                <w:lang w:val="nl-NL"/>
+              </w:rPr>
+            </w:r>
+            <w:r>
+              <w:rPr>
+                <w:webHidden/>
+                <w:lang w:val="nl-NL"/>
               </w:rPr>
               <w:fldChar w:fldCharType="separate"/>
             </w:r>
             <w:r>
               <w:rPr>
                 <w:webHidden/>
+                <w:lang w:val="nl-NL"/>
               </w:rPr>
               <w:t>3</w:t>
             </w:r>
             <w:r>
               <w:rPr>
                 <w:webHidden/>
+                <w:lang w:val="nl-NL"/>
               </w:rPr>
               <w:fldChar w:fldCharType="end"/>
             </w:r>
@@ -775,7 +789,7 @@
               <w:kern w:val="2"/>
               <w:sz w:val="24"/>
               <w:szCs w:val="24"/>
-              <w:lang w:val="en-NL" w:eastAsia="en-NL"/>
+              <w:lang w:val="nl-NL" w:eastAsia="en-NL"/>
               <w14:ligatures w14:val="standardContextual"/>
             </w:rPr>
           </w:pPr>
@@ -783,6 +797,7 @@
             <w:r>
               <w:rPr>
                 <w:rStyle w:val="Hyperlink"/>
+                <w:lang w:val="nl-NL"/>
               </w:rPr>
               <w:t>1.1.</w:t>
             </w:r>
@@ -792,7 +807,7 @@
                 <w:kern w:val="2"/>
                 <w:sz w:val="24"/>
                 <w:szCs w:val="24"/>
-                <w:lang w:val="en-NL" w:eastAsia="en-NL"/>
+                <w:lang w:val="nl-NL" w:eastAsia="en-NL"/>
                 <w14:ligatures w14:val="standardContextual"/>
               </w:rPr>
               <w:tab/>
@@ -807,41 +822,48 @@
             <w:r>
               <w:rPr>
                 <w:webHidden/>
+                <w:lang w:val="nl-NL"/>
               </w:rPr>
               <w:tab/>
             </w:r>
             <w:r>
               <w:rPr>
                 <w:webHidden/>
+                <w:lang w:val="nl-NL"/>
               </w:rPr>
               <w:fldChar w:fldCharType="begin"/>
             </w:r>
             <w:r>
               <w:rPr>
                 <w:webHidden/>
+                <w:lang w:val="nl-NL"/>
               </w:rPr>
               <w:instrText xml:space="preserve"> PAGEREF _Toc225342851 \h </w:instrText>
             </w:r>
             <w:r>
               <w:rPr>
                 <w:webHidden/>
-              </w:rPr>
-            </w:r>
-            <w:r>
-              <w:rPr>
-                <w:webHidden/>
+                <w:lang w:val="nl-NL"/>
+              </w:rPr>
+            </w:r>
+            <w:r>
+              <w:rPr>
+                <w:webHidden/>
+                <w:lang w:val="nl-NL"/>
               </w:rPr>
               <w:fldChar w:fldCharType="separate"/>
             </w:r>
             <w:r>
               <w:rPr>
                 <w:webHidden/>
+                <w:lang w:val="nl-NL"/>
               </w:rPr>
               <w:t>3</w:t>
             </w:r>
             <w:r>
               <w:rPr>
                 <w:webHidden/>
+                <w:lang w:val="nl-NL"/>
               </w:rPr>
               <w:fldChar w:fldCharType="end"/>
             </w:r>
@@ -855,7 +877,7 @@
               <w:kern w:val="2"/>
               <w:sz w:val="24"/>
               <w:szCs w:val="24"/>
-              <w:lang w:val="en-NL" w:eastAsia="en-NL"/>
+              <w:lang w:val="nl-NL" w:eastAsia="en-NL"/>
               <w14:ligatures w14:val="standardContextual"/>
             </w:rPr>
           </w:pPr>
@@ -863,6 +885,7 @@
             <w:r>
               <w:rPr>
                 <w:rStyle w:val="Hyperlink"/>
+                <w:lang w:val="nl-NL"/>
               </w:rPr>
               <w:t>1.2.</w:t>
             </w:r>
@@ -872,7 +895,7 @@
                 <w:kern w:val="2"/>
                 <w:sz w:val="24"/>
                 <w:szCs w:val="24"/>
-                <w:lang w:val="en-NL" w:eastAsia="en-NL"/>
+                <w:lang w:val="nl-NL" w:eastAsia="en-NL"/>
                 <w14:ligatures w14:val="standardContextual"/>
               </w:rPr>
               <w:tab/>
@@ -887,41 +910,48 @@
             <w:r>
               <w:rPr>
                 <w:webHidden/>
+                <w:lang w:val="nl-NL"/>
               </w:rPr>
               <w:tab/>
             </w:r>
             <w:r>
               <w:rPr>
                 <w:webHidden/>
+                <w:lang w:val="nl-NL"/>
               </w:rPr>
               <w:fldChar w:fldCharType="begin"/>
             </w:r>
             <w:r>
               <w:rPr>
                 <w:webHidden/>
+                <w:lang w:val="nl-NL"/>
               </w:rPr>
               <w:instrText xml:space="preserve"> PAGEREF _Toc225342852 \h </w:instrText>
             </w:r>
             <w:r>
               <w:rPr>
                 <w:webHidden/>
-              </w:rPr>
-            </w:r>
-            <w:r>
-              <w:rPr>
-                <w:webHidden/>
+                <w:lang w:val="nl-NL"/>
+              </w:rPr>
+            </w:r>
+            <w:r>
+              <w:rPr>
+                <w:webHidden/>
+                <w:lang w:val="nl-NL"/>
               </w:rPr>
               <w:fldChar w:fldCharType="separate"/>
             </w:r>
             <w:r>
               <w:rPr>
                 <w:webHidden/>
+                <w:lang w:val="nl-NL"/>
               </w:rPr>
               <w:t>3</w:t>
             </w:r>
             <w:r>
               <w:rPr>
                 <w:webHidden/>
+                <w:lang w:val="nl-NL"/>
               </w:rPr>
               <w:fldChar w:fldCharType="end"/>
             </w:r>
@@ -935,7 +965,7 @@
               <w:kern w:val="2"/>
               <w:sz w:val="24"/>
               <w:szCs w:val="24"/>
-              <w:lang w:val="en-NL" w:eastAsia="en-NL"/>
+              <w:lang w:val="nl-NL" w:eastAsia="en-NL"/>
               <w14:ligatures w14:val="standardContextual"/>
             </w:rPr>
           </w:pPr>
@@ -953,7 +983,7 @@
                 <w:kern w:val="2"/>
                 <w:sz w:val="24"/>
                 <w:szCs w:val="24"/>
-                <w:lang w:val="en-NL" w:eastAsia="en-NL"/>
+                <w:lang w:val="nl-NL" w:eastAsia="en-NL"/>
                 <w14:ligatures w14:val="standardContextual"/>
               </w:rPr>
               <w:tab/>
@@ -968,41 +998,48 @@
             <w:r>
               <w:rPr>
                 <w:webHidden/>
+                <w:lang w:val="nl-NL"/>
               </w:rPr>
               <w:tab/>
             </w:r>
             <w:r>
               <w:rPr>
                 <w:webHidden/>
+                <w:lang w:val="nl-NL"/>
               </w:rPr>
               <w:fldChar w:fldCharType="begin"/>
             </w:r>
             <w:r>
               <w:rPr>
                 <w:webHidden/>
+                <w:lang w:val="nl-NL"/>
               </w:rPr>
               <w:instrText xml:space="preserve"> PAGEREF _Toc225342853 \h </w:instrText>
             </w:r>
             <w:r>
               <w:rPr>
                 <w:webHidden/>
-              </w:rPr>
-            </w:r>
-            <w:r>
-              <w:rPr>
-                <w:webHidden/>
+                <w:lang w:val="nl-NL"/>
+              </w:rPr>
+            </w:r>
+            <w:r>
+              <w:rPr>
+                <w:webHidden/>
+                <w:lang w:val="nl-NL"/>
               </w:rPr>
               <w:fldChar w:fldCharType="separate"/>
             </w:r>
             <w:r>
               <w:rPr>
                 <w:webHidden/>
+                <w:lang w:val="nl-NL"/>
               </w:rPr>
               <w:t>4</w:t>
             </w:r>
             <w:r>
               <w:rPr>
                 <w:webHidden/>
+                <w:lang w:val="nl-NL"/>
               </w:rPr>
               <w:fldChar w:fldCharType="end"/>
             </w:r>
@@ -1016,7 +1053,7 @@
               <w:kern w:val="2"/>
               <w:sz w:val="24"/>
               <w:szCs w:val="24"/>
-              <w:lang w:val="en-NL" w:eastAsia="en-NL"/>
+              <w:lang w:val="nl-NL" w:eastAsia="en-NL"/>
               <w14:ligatures w14:val="standardContextual"/>
             </w:rPr>
           </w:pPr>
@@ -1024,6 +1061,7 @@
             <w:r>
               <w:rPr>
                 <w:rStyle w:val="Hyperlink"/>
+                <w:lang w:val="nl-NL"/>
               </w:rPr>
               <w:t>2.1.</w:t>
             </w:r>
@@ -1033,7 +1071,7 @@
                 <w:kern w:val="2"/>
                 <w:sz w:val="24"/>
                 <w:szCs w:val="24"/>
-                <w:lang w:val="en-NL" w:eastAsia="en-NL"/>
+                <w:lang w:val="nl-NL" w:eastAsia="en-NL"/>
                 <w14:ligatures w14:val="standardContextual"/>
               </w:rPr>
               <w:tab/>
@@ -1048,41 +1086,48 @@
             <w:r>
               <w:rPr>
                 <w:webHidden/>
+                <w:lang w:val="nl-NL"/>
               </w:rPr>
               <w:tab/>
             </w:r>
             <w:r>
               <w:rPr>
                 <w:webHidden/>
+                <w:lang w:val="nl-NL"/>
               </w:rPr>
               <w:fldChar w:fldCharType="begin"/>
             </w:r>
             <w:r>
               <w:rPr>
                 <w:webHidden/>
+                <w:lang w:val="nl-NL"/>
               </w:rPr>
               <w:instrText xml:space="preserve"> PAGEREF _Toc225342854 \h </w:instrText>
             </w:r>
             <w:r>
               <w:rPr>
                 <w:webHidden/>
-              </w:rPr>
-            </w:r>
-            <w:r>
-              <w:rPr>
-                <w:webHidden/>
+                <w:lang w:val="nl-NL"/>
+              </w:rPr>
+            </w:r>
+            <w:r>
+              <w:rPr>
+                <w:webHidden/>
+                <w:lang w:val="nl-NL"/>
               </w:rPr>
               <w:fldChar w:fldCharType="separate"/>
             </w:r>
             <w:r>
               <w:rPr>
                 <w:webHidden/>
+                <w:lang w:val="nl-NL"/>
               </w:rPr>
               <w:t>4</w:t>
             </w:r>
             <w:r>
               <w:rPr>
                 <w:webHidden/>
+                <w:lang w:val="nl-NL"/>
               </w:rPr>
               <w:fldChar w:fldCharType="end"/>
             </w:r>
@@ -1096,7 +1141,7 @@
               <w:kern w:val="2"/>
               <w:sz w:val="24"/>
               <w:szCs w:val="24"/>
-              <w:lang w:val="en-NL" w:eastAsia="en-NL"/>
+              <w:lang w:val="nl-NL" w:eastAsia="en-NL"/>
               <w14:ligatures w14:val="standardContextual"/>
             </w:rPr>
           </w:pPr>
@@ -1104,6 +1149,7 @@
             <w:r>
               <w:rPr>
                 <w:rStyle w:val="Hyperlink"/>
+                <w:lang w:val="nl-NL"/>
               </w:rPr>
               <w:t>2.2.</w:t>
             </w:r>
@@ -1113,7 +1159,7 @@
                 <w:kern w:val="2"/>
                 <w:sz w:val="24"/>
                 <w:szCs w:val="24"/>
-                <w:lang w:val="en-NL" w:eastAsia="en-NL"/>
+                <w:lang w:val="nl-NL" w:eastAsia="en-NL"/>
                 <w14:ligatures w14:val="standardContextual"/>
               </w:rPr>
               <w:tab/>
@@ -1128,41 +1174,48 @@
             <w:r>
               <w:rPr>
                 <w:webHidden/>
+                <w:lang w:val="nl-NL"/>
               </w:rPr>
               <w:tab/>
             </w:r>
             <w:r>
               <w:rPr>
                 <w:webHidden/>
+                <w:lang w:val="nl-NL"/>
               </w:rPr>
               <w:fldChar w:fldCharType="begin"/>
             </w:r>
             <w:r>
               <w:rPr>
                 <w:webHidden/>
+                <w:lang w:val="nl-NL"/>
               </w:rPr>
               <w:instrText xml:space="preserve"> PAGEREF _Toc225342855 \h </w:instrText>
             </w:r>
             <w:r>
               <w:rPr>
                 <w:webHidden/>
-              </w:rPr>
-            </w:r>
-            <w:r>
-              <w:rPr>
-                <w:webHidden/>
+                <w:lang w:val="nl-NL"/>
+              </w:rPr>
+            </w:r>
+            <w:r>
+              <w:rPr>
+                <w:webHidden/>
+                <w:lang w:val="nl-NL"/>
               </w:rPr>
               <w:fldChar w:fldCharType="separate"/>
             </w:r>
             <w:r>
               <w:rPr>
                 <w:webHidden/>
+                <w:lang w:val="nl-NL"/>
               </w:rPr>
               <w:t>4</w:t>
             </w:r>
             <w:r>
               <w:rPr>
                 <w:webHidden/>
+                <w:lang w:val="nl-NL"/>
               </w:rPr>
               <w:fldChar w:fldCharType="end"/>
             </w:r>
@@ -1176,7 +1229,7 @@
               <w:kern w:val="2"/>
               <w:sz w:val="24"/>
               <w:szCs w:val="24"/>
-              <w:lang w:val="en-NL" w:eastAsia="en-NL"/>
+              <w:lang w:val="nl-NL" w:eastAsia="en-NL"/>
               <w14:ligatures w14:val="standardContextual"/>
             </w:rPr>
           </w:pPr>
@@ -1194,7 +1247,7 @@
                 <w:kern w:val="2"/>
                 <w:sz w:val="24"/>
                 <w:szCs w:val="24"/>
-                <w:lang w:val="en-NL" w:eastAsia="en-NL"/>
+                <w:lang w:val="nl-NL" w:eastAsia="en-NL"/>
                 <w14:ligatures w14:val="standardContextual"/>
               </w:rPr>
               <w:tab/>
@@ -1209,41 +1262,48 @@
             <w:r>
               <w:rPr>
                 <w:webHidden/>
+                <w:lang w:val="nl-NL"/>
               </w:rPr>
               <w:tab/>
             </w:r>
             <w:r>
               <w:rPr>
                 <w:webHidden/>
+                <w:lang w:val="nl-NL"/>
               </w:rPr>
               <w:fldChar w:fldCharType="begin"/>
             </w:r>
             <w:r>
               <w:rPr>
                 <w:webHidden/>
+                <w:lang w:val="nl-NL"/>
               </w:rPr>
               <w:instrText xml:space="preserve"> PAGEREF _Toc225342856 \h </w:instrText>
             </w:r>
             <w:r>
               <w:rPr>
                 <w:webHidden/>
-              </w:rPr>
-            </w:r>
-            <w:r>
-              <w:rPr>
-                <w:webHidden/>
+                <w:lang w:val="nl-NL"/>
+              </w:rPr>
+            </w:r>
+            <w:r>
+              <w:rPr>
+                <w:webHidden/>
+                <w:lang w:val="nl-NL"/>
               </w:rPr>
               <w:fldChar w:fldCharType="separate"/>
             </w:r>
             <w:r>
               <w:rPr>
                 <w:webHidden/>
+                <w:lang w:val="nl-NL"/>
               </w:rPr>
               <w:t>6</w:t>
             </w:r>
             <w:r>
               <w:rPr>
                 <w:webHidden/>
+                <w:lang w:val="nl-NL"/>
               </w:rPr>
               <w:fldChar w:fldCharType="end"/>
             </w:r>
@@ -1257,7 +1317,7 @@
               <w:kern w:val="2"/>
               <w:sz w:val="24"/>
               <w:szCs w:val="24"/>
-              <w:lang w:val="en-NL" w:eastAsia="en-NL"/>
+              <w:lang w:val="nl-NL" w:eastAsia="en-NL"/>
               <w14:ligatures w14:val="standardContextual"/>
             </w:rPr>
           </w:pPr>
@@ -1265,6 +1325,7 @@
             <w:r>
               <w:rPr>
                 <w:rStyle w:val="Hyperlink"/>
+                <w:lang w:val="nl-NL"/>
               </w:rPr>
               <w:t>3.1.</w:t>
             </w:r>
@@ -1274,7 +1335,7 @@
                 <w:kern w:val="2"/>
                 <w:sz w:val="24"/>
                 <w:szCs w:val="24"/>
-                <w:lang w:val="en-NL" w:eastAsia="en-NL"/>
+                <w:lang w:val="nl-NL" w:eastAsia="en-NL"/>
                 <w14:ligatures w14:val="standardContextual"/>
               </w:rPr>
               <w:tab/>
@@ -1289,41 +1350,48 @@
             <w:r>
               <w:rPr>
                 <w:webHidden/>
+                <w:lang w:val="nl-NL"/>
               </w:rPr>
               <w:tab/>
             </w:r>
             <w:r>
               <w:rPr>
                 <w:webHidden/>
+                <w:lang w:val="nl-NL"/>
               </w:rPr>
               <w:fldChar w:fldCharType="begin"/>
             </w:r>
             <w:r>
               <w:rPr>
                 <w:webHidden/>
+                <w:lang w:val="nl-NL"/>
               </w:rPr>
               <w:instrText xml:space="preserve"> PAGEREF _Toc225342857 \h </w:instrText>
             </w:r>
             <w:r>
               <w:rPr>
                 <w:webHidden/>
-              </w:rPr>
-            </w:r>
-            <w:r>
-              <w:rPr>
-                <w:webHidden/>
+                <w:lang w:val="nl-NL"/>
+              </w:rPr>
+            </w:r>
+            <w:r>
+              <w:rPr>
+                <w:webHidden/>
+                <w:lang w:val="nl-NL"/>
               </w:rPr>
               <w:fldChar w:fldCharType="separate"/>
             </w:r>
             <w:r>
               <w:rPr>
                 <w:webHidden/>
+                <w:lang w:val="nl-NL"/>
               </w:rPr>
               <w:t>6</w:t>
             </w:r>
             <w:r>
               <w:rPr>
                 <w:webHidden/>
+                <w:lang w:val="nl-NL"/>
               </w:rPr>
               <w:fldChar w:fldCharType="end"/>
             </w:r>
@@ -1337,7 +1405,7 @@
               <w:kern w:val="2"/>
               <w:sz w:val="24"/>
               <w:szCs w:val="24"/>
-              <w:lang w:val="en-NL" w:eastAsia="en-NL"/>
+              <w:lang w:val="nl-NL" w:eastAsia="en-NL"/>
               <w14:ligatures w14:val="standardContextual"/>
             </w:rPr>
           </w:pPr>
@@ -1345,6 +1413,7 @@
             <w:r>
               <w:rPr>
                 <w:rStyle w:val="Hyperlink"/>
+                <w:lang w:val="nl-NL"/>
               </w:rPr>
               <w:t>3.2.</w:t>
             </w:r>
@@ -1354,7 +1423,7 @@
                 <w:kern w:val="2"/>
                 <w:sz w:val="24"/>
                 <w:szCs w:val="24"/>
-                <w:lang w:val="en-NL" w:eastAsia="en-NL"/>
+                <w:lang w:val="nl-NL" w:eastAsia="en-NL"/>
                 <w14:ligatures w14:val="standardContextual"/>
               </w:rPr>
               <w:tab/>
@@ -1369,41 +1438,48 @@
             <w:r>
               <w:rPr>
                 <w:webHidden/>
+                <w:lang w:val="nl-NL"/>
               </w:rPr>
               <w:tab/>
             </w:r>
             <w:r>
               <w:rPr>
                 <w:webHidden/>
+                <w:lang w:val="nl-NL"/>
               </w:rPr>
               <w:fldChar w:fldCharType="begin"/>
             </w:r>
             <w:r>
               <w:rPr>
                 <w:webHidden/>
+                <w:lang w:val="nl-NL"/>
               </w:rPr>
               <w:instrText xml:space="preserve"> PAGEREF _Toc225342858 \h </w:instrText>
             </w:r>
             <w:r>
               <w:rPr>
                 <w:webHidden/>
-              </w:rPr>
-            </w:r>
-            <w:r>
-              <w:rPr>
-                <w:webHidden/>
+                <w:lang w:val="nl-NL"/>
+              </w:rPr>
+            </w:r>
+            <w:r>
+              <w:rPr>
+                <w:webHidden/>
+                <w:lang w:val="nl-NL"/>
               </w:rPr>
               <w:fldChar w:fldCharType="separate"/>
             </w:r>
             <w:r>
               <w:rPr>
                 <w:webHidden/>
+                <w:lang w:val="nl-NL"/>
               </w:rPr>
               <w:t>6</w:t>
             </w:r>
             <w:r>
               <w:rPr>
                 <w:webHidden/>
+                <w:lang w:val="nl-NL"/>
               </w:rPr>
               <w:fldChar w:fldCharType="end"/>
             </w:r>
@@ -1417,7 +1493,7 @@
               <w:kern w:val="2"/>
               <w:sz w:val="24"/>
               <w:szCs w:val="24"/>
-              <w:lang w:val="en-NL" w:eastAsia="en-NL"/>
+              <w:lang w:val="nl-NL" w:eastAsia="en-NL"/>
               <w14:ligatures w14:val="standardContextual"/>
             </w:rPr>
           </w:pPr>
@@ -1425,6 +1501,7 @@
             <w:r>
               <w:rPr>
                 <w:rStyle w:val="Hyperlink"/>
+                <w:lang w:val="nl-NL"/>
               </w:rPr>
               <w:t>3.3.</w:t>
             </w:r>
@@ -1434,7 +1511,7 @@
                 <w:kern w:val="2"/>
                 <w:sz w:val="24"/>
                 <w:szCs w:val="24"/>
-                <w:lang w:val="en-NL" w:eastAsia="en-NL"/>
+                <w:lang w:val="nl-NL" w:eastAsia="en-NL"/>
                 <w14:ligatures w14:val="standardContextual"/>
               </w:rPr>
               <w:tab/>
@@ -1449,41 +1526,48 @@
             <w:r>
               <w:rPr>
                 <w:webHidden/>
+                <w:lang w:val="nl-NL"/>
               </w:rPr>
               <w:tab/>
             </w:r>
             <w:r>
               <w:rPr>
                 <w:webHidden/>
+                <w:lang w:val="nl-NL"/>
               </w:rPr>
               <w:fldChar w:fldCharType="begin"/>
             </w:r>
             <w:r>
               <w:rPr>
                 <w:webHidden/>
+                <w:lang w:val="nl-NL"/>
               </w:rPr>
               <w:instrText xml:space="preserve"> PAGEREF _Toc225342859 \h </w:instrText>
             </w:r>
             <w:r>
               <w:rPr>
                 <w:webHidden/>
-              </w:rPr>
-            </w:r>
-            <w:r>
-              <w:rPr>
-                <w:webHidden/>
+                <w:lang w:val="nl-NL"/>
+              </w:rPr>
+            </w:r>
+            <w:r>
+              <w:rPr>
+                <w:webHidden/>
+                <w:lang w:val="nl-NL"/>
               </w:rPr>
               <w:fldChar w:fldCharType="separate"/>
             </w:r>
             <w:r>
               <w:rPr>
                 <w:webHidden/>
+                <w:lang w:val="nl-NL"/>
               </w:rPr>
               <w:t>7</w:t>
             </w:r>
             <w:r>
               <w:rPr>
                 <w:webHidden/>
+                <w:lang w:val="nl-NL"/>
               </w:rPr>
               <w:fldChar w:fldCharType="end"/>
             </w:r>
@@ -1497,7 +1581,7 @@
               <w:kern w:val="2"/>
               <w:sz w:val="24"/>
               <w:szCs w:val="24"/>
-              <w:lang w:val="en-NL" w:eastAsia="en-NL"/>
+              <w:lang w:val="nl-NL" w:eastAsia="en-NL"/>
               <w14:ligatures w14:val="standardContextual"/>
             </w:rPr>
           </w:pPr>
@@ -1515,7 +1599,7 @@
                 <w:kern w:val="2"/>
                 <w:sz w:val="24"/>
                 <w:szCs w:val="24"/>
-                <w:lang w:val="en-NL" w:eastAsia="en-NL"/>
+                <w:lang w:val="nl-NL" w:eastAsia="en-NL"/>
                 <w14:ligatures w14:val="standardContextual"/>
               </w:rPr>
               <w:tab/>
@@ -1530,41 +1614,48 @@
             <w:r>
               <w:rPr>
                 <w:webHidden/>
+                <w:lang w:val="nl-NL"/>
               </w:rPr>
               <w:tab/>
             </w:r>
             <w:r>
               <w:rPr>
                 <w:webHidden/>
+                <w:lang w:val="nl-NL"/>
               </w:rPr>
               <w:fldChar w:fldCharType="begin"/>
             </w:r>
             <w:r>
               <w:rPr>
                 <w:webHidden/>
+                <w:lang w:val="nl-NL"/>
               </w:rPr>
               <w:instrText xml:space="preserve"> PAGEREF _Toc225342860 \h </w:instrText>
             </w:r>
             <w:r>
               <w:rPr>
                 <w:webHidden/>
-              </w:rPr>
-            </w:r>
-            <w:r>
-              <w:rPr>
-                <w:webHidden/>
+                <w:lang w:val="nl-NL"/>
+              </w:rPr>
+            </w:r>
+            <w:r>
+              <w:rPr>
+                <w:webHidden/>
+                <w:lang w:val="nl-NL"/>
               </w:rPr>
               <w:fldChar w:fldCharType="separate"/>
             </w:r>
             <w:r>
               <w:rPr>
                 <w:webHidden/>
+                <w:lang w:val="nl-NL"/>
               </w:rPr>
               <w:t>8</w:t>
             </w:r>
             <w:r>
               <w:rPr>
                 <w:webHidden/>
+                <w:lang w:val="nl-NL"/>
               </w:rPr>
               <w:fldChar w:fldCharType="end"/>
             </w:r>
@@ -1578,7 +1669,7 @@
               <w:kern w:val="2"/>
               <w:sz w:val="24"/>
               <w:szCs w:val="24"/>
-              <w:lang w:val="en-NL" w:eastAsia="en-NL"/>
+              <w:lang w:val="nl-NL" w:eastAsia="en-NL"/>
               <w14:ligatures w14:val="standardContextual"/>
             </w:rPr>
           </w:pPr>
@@ -1586,6 +1677,7 @@
             <w:r>
               <w:rPr>
                 <w:rStyle w:val="Hyperlink"/>
+                <w:lang w:val="nl-NL"/>
               </w:rPr>
               <w:t>4.1.</w:t>
             </w:r>
@@ -1595,7 +1687,7 @@
                 <w:kern w:val="2"/>
                 <w:sz w:val="24"/>
                 <w:szCs w:val="24"/>
-                <w:lang w:val="en-NL" w:eastAsia="en-NL"/>
+                <w:lang w:val="nl-NL" w:eastAsia="en-NL"/>
                 <w14:ligatures w14:val="standardContextual"/>
               </w:rPr>
               <w:tab/>
@@ -1610,41 +1702,48 @@
             <w:r>
               <w:rPr>
                 <w:webHidden/>
+                <w:lang w:val="nl-NL"/>
               </w:rPr>
               <w:tab/>
             </w:r>
             <w:r>
               <w:rPr>
                 <w:webHidden/>
+                <w:lang w:val="nl-NL"/>
               </w:rPr>
               <w:fldChar w:fldCharType="begin"/>
             </w:r>
             <w:r>
               <w:rPr>
                 <w:webHidden/>
+                <w:lang w:val="nl-NL"/>
               </w:rPr>
               <w:instrText xml:space="preserve"> PAGEREF _Toc225342861 \h </w:instrText>
             </w:r>
             <w:r>
               <w:rPr>
                 <w:webHidden/>
-              </w:rPr>
-            </w:r>
-            <w:r>
-              <w:rPr>
-                <w:webHidden/>
+                <w:lang w:val="nl-NL"/>
+              </w:rPr>
+            </w:r>
+            <w:r>
+              <w:rPr>
+                <w:webHidden/>
+                <w:lang w:val="nl-NL"/>
               </w:rPr>
               <w:fldChar w:fldCharType="separate"/>
             </w:r>
             <w:r>
               <w:rPr>
                 <w:webHidden/>
+                <w:lang w:val="nl-NL"/>
               </w:rPr>
               <w:t>8</w:t>
             </w:r>
             <w:r>
               <w:rPr>
                 <w:webHidden/>
+                <w:lang w:val="nl-NL"/>
               </w:rPr>
               <w:fldChar w:fldCharType="end"/>
             </w:r>
@@ -1658,7 +1757,7 @@
               <w:kern w:val="2"/>
               <w:sz w:val="24"/>
               <w:szCs w:val="24"/>
-              <w:lang w:val="en-NL" w:eastAsia="en-NL"/>
+              <w:lang w:val="nl-NL" w:eastAsia="en-NL"/>
               <w14:ligatures w14:val="standardContextual"/>
             </w:rPr>
           </w:pPr>
@@ -1666,6 +1765,7 @@
             <w:r>
               <w:rPr>
                 <w:rStyle w:val="Hyperlink"/>
+                <w:lang w:val="nl-NL"/>
               </w:rPr>
               <w:t>4.2.</w:t>
             </w:r>
@@ -1675,7 +1775,7 @@
                 <w:kern w:val="2"/>
                 <w:sz w:val="24"/>
                 <w:szCs w:val="24"/>
-                <w:lang w:val="en-NL" w:eastAsia="en-NL"/>
+                <w:lang w:val="nl-NL" w:eastAsia="en-NL"/>
                 <w14:ligatures w14:val="standardContextual"/>
               </w:rPr>
               <w:tab/>
@@ -1690,41 +1790,48 @@
             <w:r>
               <w:rPr>
                 <w:webHidden/>
+                <w:lang w:val="nl-NL"/>
               </w:rPr>
               <w:tab/>
             </w:r>
             <w:r>
               <w:rPr>
                 <w:webHidden/>
+                <w:lang w:val="nl-NL"/>
               </w:rPr>
               <w:fldChar w:fldCharType="begin"/>
             </w:r>
             <w:r>
               <w:rPr>
                 <w:webHidden/>
+                <w:lang w:val="nl-NL"/>
               </w:rPr>
               <w:instrText xml:space="preserve"> PAGEREF _Toc225342862 \h </w:instrText>
             </w:r>
             <w:r>
               <w:rPr>
                 <w:webHidden/>
-              </w:rPr>
-            </w:r>
-            <w:r>
-              <w:rPr>
-                <w:webHidden/>
+                <w:lang w:val="nl-NL"/>
+              </w:rPr>
+            </w:r>
+            <w:r>
+              <w:rPr>
+                <w:webHidden/>
+                <w:lang w:val="nl-NL"/>
               </w:rPr>
               <w:fldChar w:fldCharType="separate"/>
             </w:r>
             <w:r>
               <w:rPr>
                 <w:webHidden/>
+                <w:lang w:val="nl-NL"/>
               </w:rPr>
               <w:t>9</w:t>
             </w:r>
             <w:r>
               <w:rPr>
                 <w:webHidden/>
+                <w:lang w:val="nl-NL"/>
               </w:rPr>
               <w:fldChar w:fldCharType="end"/>
             </w:r>
@@ -1738,7 +1845,7 @@
               <w:kern w:val="2"/>
               <w:sz w:val="24"/>
               <w:szCs w:val="24"/>
-              <w:lang w:val="en-NL" w:eastAsia="en-NL"/>
+              <w:lang w:val="nl-NL" w:eastAsia="en-NL"/>
               <w14:ligatures w14:val="standardContextual"/>
             </w:rPr>
           </w:pPr>
@@ -1746,6 +1853,7 @@
             <w:r>
               <w:rPr>
                 <w:rStyle w:val="Hyperlink"/>
+                <w:lang w:val="nl-NL"/>
               </w:rPr>
               <w:t>4.3.</w:t>
             </w:r>
@@ -1755,7 +1863,7 @@
                 <w:kern w:val="2"/>
                 <w:sz w:val="24"/>
                 <w:szCs w:val="24"/>
-                <w:lang w:val="en-NL" w:eastAsia="en-NL"/>
+                <w:lang w:val="nl-NL" w:eastAsia="en-NL"/>
                 <w14:ligatures w14:val="standardContextual"/>
               </w:rPr>
               <w:tab/>
@@ -1770,41 +1878,48 @@
             <w:r>
               <w:rPr>
                 <w:webHidden/>
+                <w:lang w:val="nl-NL"/>
               </w:rPr>
               <w:tab/>
             </w:r>
             <w:r>
               <w:rPr>
                 <w:webHidden/>
+                <w:lang w:val="nl-NL"/>
               </w:rPr>
               <w:fldChar w:fldCharType="begin"/>
             </w:r>
             <w:r>
               <w:rPr>
                 <w:webHidden/>
+                <w:lang w:val="nl-NL"/>
               </w:rPr>
               <w:instrText xml:space="preserve"> PAGEREF _Toc225342863 \h </w:instrText>
             </w:r>
             <w:r>
               <w:rPr>
                 <w:webHidden/>
-              </w:rPr>
-            </w:r>
-            <w:r>
-              <w:rPr>
-                <w:webHidden/>
+                <w:lang w:val="nl-NL"/>
+              </w:rPr>
+            </w:r>
+            <w:r>
+              <w:rPr>
+                <w:webHidden/>
+                <w:lang w:val="nl-NL"/>
               </w:rPr>
               <w:fldChar w:fldCharType="separate"/>
             </w:r>
             <w:r>
               <w:rPr>
                 <w:webHidden/>
+                <w:lang w:val="nl-NL"/>
               </w:rPr>
               <w:t>11</w:t>
             </w:r>
             <w:r>
               <w:rPr>
                 <w:webHidden/>
+                <w:lang w:val="nl-NL"/>
               </w:rPr>
               <w:fldChar w:fldCharType="end"/>
             </w:r>
@@ -1818,7 +1933,7 @@
               <w:kern w:val="2"/>
               <w:sz w:val="24"/>
               <w:szCs w:val="24"/>
-              <w:lang w:val="en-NL" w:eastAsia="en-NL"/>
+              <w:lang w:val="nl-NL" w:eastAsia="en-NL"/>
               <w14:ligatures w14:val="standardContextual"/>
             </w:rPr>
           </w:pPr>
@@ -1826,6 +1941,7 @@
             <w:r>
               <w:rPr>
                 <w:rStyle w:val="Hyperlink"/>
+                <w:lang w:val="nl-NL"/>
               </w:rPr>
               <w:t>4.4.</w:t>
             </w:r>
@@ -1835,7 +1951,7 @@
                 <w:kern w:val="2"/>
                 <w:sz w:val="24"/>
                 <w:szCs w:val="24"/>
-                <w:lang w:val="en-NL" w:eastAsia="en-NL"/>
+                <w:lang w:val="nl-NL" w:eastAsia="en-NL"/>
                 <w14:ligatures w14:val="standardContextual"/>
               </w:rPr>
               <w:tab/>
@@ -1850,41 +1966,48 @@
             <w:r>
               <w:rPr>
                 <w:webHidden/>
+                <w:lang w:val="nl-NL"/>
               </w:rPr>
               <w:tab/>
             </w:r>
             <w:r>
               <w:rPr>
                 <w:webHidden/>
+                <w:lang w:val="nl-NL"/>
               </w:rPr>
               <w:fldChar w:fldCharType="begin"/>
             </w:r>
             <w:r>
               <w:rPr>
                 <w:webHidden/>
+                <w:lang w:val="nl-NL"/>
               </w:rPr>
               <w:instrText xml:space="preserve"> PAGEREF _Toc225342864 \h </w:instrText>
             </w:r>
             <w:r>
               <w:rPr>
                 <w:webHidden/>
-              </w:rPr>
-            </w:r>
-            <w:r>
-              <w:rPr>
-                <w:webHidden/>
+                <w:lang w:val="nl-NL"/>
+              </w:rPr>
+            </w:r>
+            <w:r>
+              <w:rPr>
+                <w:webHidden/>
+                <w:lang w:val="nl-NL"/>
               </w:rPr>
               <w:fldChar w:fldCharType="separate"/>
             </w:r>
             <w:r>
               <w:rPr>
                 <w:webHidden/>
+                <w:lang w:val="nl-NL"/>
               </w:rPr>
               <w:t>12</w:t>
             </w:r>
             <w:r>
               <w:rPr>
                 <w:webHidden/>
+                <w:lang w:val="nl-NL"/>
               </w:rPr>
               <w:fldChar w:fldCharType="end"/>
             </w:r>
@@ -1898,7 +2021,7 @@
               <w:kern w:val="2"/>
               <w:sz w:val="24"/>
               <w:szCs w:val="24"/>
-              <w:lang w:val="en-NL" w:eastAsia="en-NL"/>
+              <w:lang w:val="nl-NL" w:eastAsia="en-NL"/>
               <w14:ligatures w14:val="standardContextual"/>
             </w:rPr>
           </w:pPr>
@@ -1916,7 +2039,7 @@
                 <w:kern w:val="2"/>
                 <w:sz w:val="24"/>
                 <w:szCs w:val="24"/>
-                <w:lang w:val="en-NL" w:eastAsia="en-NL"/>
+                <w:lang w:val="nl-NL" w:eastAsia="en-NL"/>
                 <w14:ligatures w14:val="standardContextual"/>
               </w:rPr>
               <w:tab/>
@@ -1931,41 +2054,48 @@
             <w:r>
               <w:rPr>
                 <w:webHidden/>
+                <w:lang w:val="nl-NL"/>
               </w:rPr>
               <w:tab/>
             </w:r>
             <w:r>
               <w:rPr>
                 <w:webHidden/>
+                <w:lang w:val="nl-NL"/>
               </w:rPr>
               <w:fldChar w:fldCharType="begin"/>
             </w:r>
             <w:r>
               <w:rPr>
                 <w:webHidden/>
+                <w:lang w:val="nl-NL"/>
               </w:rPr>
               <w:instrText xml:space="preserve"> PAGEREF _Toc225342865 \h </w:instrText>
             </w:r>
             <w:r>
               <w:rPr>
                 <w:webHidden/>
-              </w:rPr>
-            </w:r>
-            <w:r>
-              <w:rPr>
-                <w:webHidden/>
+                <w:lang w:val="nl-NL"/>
+              </w:rPr>
+            </w:r>
+            <w:r>
+              <w:rPr>
+                <w:webHidden/>
+                <w:lang w:val="nl-NL"/>
               </w:rPr>
               <w:fldChar w:fldCharType="separate"/>
             </w:r>
             <w:r>
               <w:rPr>
                 <w:webHidden/>
+                <w:lang w:val="nl-NL"/>
               </w:rPr>
               <w:t>14</w:t>
             </w:r>
             <w:r>
               <w:rPr>
                 <w:webHidden/>
+                <w:lang w:val="nl-NL"/>
               </w:rPr>
               <w:fldChar w:fldCharType="end"/>
             </w:r>
@@ -1979,7 +2109,7 @@
               <w:kern w:val="2"/>
               <w:sz w:val="24"/>
               <w:szCs w:val="24"/>
-              <w:lang w:val="en-NL" w:eastAsia="en-NL"/>
+              <w:lang w:val="nl-NL" w:eastAsia="en-NL"/>
               <w14:ligatures w14:val="standardContextual"/>
             </w:rPr>
           </w:pPr>
@@ -1987,6 +2117,7 @@
             <w:r>
               <w:rPr>
                 <w:rStyle w:val="Hyperlink"/>
+                <w:lang w:val="nl-NL"/>
               </w:rPr>
               <w:t>5.1.</w:t>
             </w:r>
@@ -1996,7 +2127,7 @@
                 <w:kern w:val="2"/>
                 <w:sz w:val="24"/>
                 <w:szCs w:val="24"/>
-                <w:lang w:val="en-NL" w:eastAsia="en-NL"/>
+                <w:lang w:val="nl-NL" w:eastAsia="en-NL"/>
                 <w14:ligatures w14:val="standardContextual"/>
               </w:rPr>
               <w:tab/>
@@ -2011,41 +2142,48 @@
             <w:r>
               <w:rPr>
                 <w:webHidden/>
+                <w:lang w:val="nl-NL"/>
               </w:rPr>
               <w:tab/>
             </w:r>
             <w:r>
               <w:rPr>
                 <w:webHidden/>
+                <w:lang w:val="nl-NL"/>
               </w:rPr>
               <w:fldChar w:fldCharType="begin"/>
             </w:r>
             <w:r>
               <w:rPr>
                 <w:webHidden/>
+                <w:lang w:val="nl-NL"/>
               </w:rPr>
               <w:instrText xml:space="preserve"> PAGEREF _Toc225342866 \h </w:instrText>
             </w:r>
             <w:r>
               <w:rPr>
                 <w:webHidden/>
-              </w:rPr>
-            </w:r>
-            <w:r>
-              <w:rPr>
-                <w:webHidden/>
+                <w:lang w:val="nl-NL"/>
+              </w:rPr>
+            </w:r>
+            <w:r>
+              <w:rPr>
+                <w:webHidden/>
+                <w:lang w:val="nl-NL"/>
               </w:rPr>
               <w:fldChar w:fldCharType="separate"/>
             </w:r>
             <w:r>
               <w:rPr>
                 <w:webHidden/>
+                <w:lang w:val="nl-NL"/>
               </w:rPr>
               <w:t>14</w:t>
             </w:r>
             <w:r>
               <w:rPr>
                 <w:webHidden/>
+                <w:lang w:val="nl-NL"/>
               </w:rPr>
               <w:fldChar w:fldCharType="end"/>
             </w:r>
@@ -2059,7 +2197,7 @@
               <w:kern w:val="2"/>
               <w:sz w:val="24"/>
               <w:szCs w:val="24"/>
-              <w:lang w:val="en-NL" w:eastAsia="en-NL"/>
+              <w:lang w:val="nl-NL" w:eastAsia="en-NL"/>
               <w14:ligatures w14:val="standardContextual"/>
             </w:rPr>
           </w:pPr>
@@ -2067,6 +2205,7 @@
             <w:r>
               <w:rPr>
                 <w:rStyle w:val="Hyperlink"/>
+                <w:lang w:val="nl-NL"/>
               </w:rPr>
               <w:t>5.2.</w:t>
             </w:r>
@@ -2076,7 +2215,7 @@
                 <w:kern w:val="2"/>
                 <w:sz w:val="24"/>
                 <w:szCs w:val="24"/>
-                <w:lang w:val="en-NL" w:eastAsia="en-NL"/>
+                <w:lang w:val="nl-NL" w:eastAsia="en-NL"/>
                 <w14:ligatures w14:val="standardContextual"/>
               </w:rPr>
               <w:tab/>
@@ -2091,41 +2230,48 @@
             <w:r>
               <w:rPr>
                 <w:webHidden/>
+                <w:lang w:val="nl-NL"/>
               </w:rPr>
               <w:tab/>
             </w:r>
             <w:r>
               <w:rPr>
                 <w:webHidden/>
+                <w:lang w:val="nl-NL"/>
               </w:rPr>
               <w:fldChar w:fldCharType="begin"/>
             </w:r>
             <w:r>
               <w:rPr>
                 <w:webHidden/>
+                <w:lang w:val="nl-NL"/>
               </w:rPr>
               <w:instrText xml:space="preserve"> PAGEREF _Toc225342867 \h </w:instrText>
             </w:r>
             <w:r>
               <w:rPr>
                 <w:webHidden/>
-              </w:rPr>
-            </w:r>
-            <w:r>
-              <w:rPr>
-                <w:webHidden/>
+                <w:lang w:val="nl-NL"/>
+              </w:rPr>
+            </w:r>
+            <w:r>
+              <w:rPr>
+                <w:webHidden/>
+                <w:lang w:val="nl-NL"/>
               </w:rPr>
               <w:fldChar w:fldCharType="separate"/>
             </w:r>
             <w:r>
               <w:rPr>
                 <w:webHidden/>
+                <w:lang w:val="nl-NL"/>
               </w:rPr>
               <w:t>15</w:t>
             </w:r>
             <w:r>
               <w:rPr>
                 <w:webHidden/>
+                <w:lang w:val="nl-NL"/>
               </w:rPr>
               <w:fldChar w:fldCharType="end"/>
             </w:r>
@@ -2139,7 +2285,7 @@
               <w:kern w:val="2"/>
               <w:sz w:val="24"/>
               <w:szCs w:val="24"/>
-              <w:lang w:val="en-NL" w:eastAsia="en-NL"/>
+              <w:lang w:val="nl-NL" w:eastAsia="en-NL"/>
               <w14:ligatures w14:val="standardContextual"/>
             </w:rPr>
           </w:pPr>
@@ -2157,7 +2303,7 @@
                 <w:kern w:val="2"/>
                 <w:sz w:val="24"/>
                 <w:szCs w:val="24"/>
-                <w:lang w:val="en-NL" w:eastAsia="en-NL"/>
+                <w:lang w:val="nl-NL" w:eastAsia="en-NL"/>
                 <w14:ligatures w14:val="standardContextual"/>
               </w:rPr>
               <w:tab/>
@@ -2172,41 +2318,48 @@
             <w:r>
               <w:rPr>
                 <w:webHidden/>
+                <w:lang w:val="nl-NL"/>
               </w:rPr>
               <w:tab/>
             </w:r>
             <w:r>
               <w:rPr>
                 <w:webHidden/>
+                <w:lang w:val="nl-NL"/>
               </w:rPr>
               <w:fldChar w:fldCharType="begin"/>
             </w:r>
             <w:r>
               <w:rPr>
                 <w:webHidden/>
+                <w:lang w:val="nl-NL"/>
               </w:rPr>
               <w:instrText xml:space="preserve"> PAGEREF _Toc225342868 \h </w:instrText>
             </w:r>
             <w:r>
               <w:rPr>
                 <w:webHidden/>
-              </w:rPr>
-            </w:r>
-            <w:r>
-              <w:rPr>
-                <w:webHidden/>
+                <w:lang w:val="nl-NL"/>
+              </w:rPr>
+            </w:r>
+            <w:r>
+              <w:rPr>
+                <w:webHidden/>
+                <w:lang w:val="nl-NL"/>
               </w:rPr>
               <w:fldChar w:fldCharType="separate"/>
             </w:r>
             <w:r>
               <w:rPr>
                 <w:webHidden/>
+                <w:lang w:val="nl-NL"/>
               </w:rPr>
               <w:t>16</w:t>
             </w:r>
             <w:r>
               <w:rPr>
                 <w:webHidden/>
+                <w:lang w:val="nl-NL"/>
               </w:rPr>
               <w:fldChar w:fldCharType="end"/>
             </w:r>
@@ -2220,7 +2373,7 @@
               <w:kern w:val="2"/>
               <w:sz w:val="24"/>
               <w:szCs w:val="24"/>
-              <w:lang w:val="en-NL" w:eastAsia="en-NL"/>
+              <w:lang w:val="nl-NL" w:eastAsia="en-NL"/>
               <w14:ligatures w14:val="standardContextual"/>
             </w:rPr>
           </w:pPr>
@@ -2228,6 +2381,7 @@
             <w:r>
               <w:rPr>
                 <w:rStyle w:val="Hyperlink"/>
+                <w:lang w:val="nl-NL"/>
               </w:rPr>
               <w:t>6.1.</w:t>
             </w:r>
@@ -2237,7 +2391,7 @@
                 <w:kern w:val="2"/>
                 <w:sz w:val="24"/>
                 <w:szCs w:val="24"/>
-                <w:lang w:val="en-NL" w:eastAsia="en-NL"/>
+                <w:lang w:val="nl-NL" w:eastAsia="en-NL"/>
                 <w14:ligatures w14:val="standardContextual"/>
               </w:rPr>
               <w:tab/>
@@ -2252,41 +2406,48 @@
             <w:r>
               <w:rPr>
                 <w:webHidden/>
+                <w:lang w:val="nl-NL"/>
               </w:rPr>
               <w:tab/>
             </w:r>
             <w:r>
               <w:rPr>
                 <w:webHidden/>
+                <w:lang w:val="nl-NL"/>
               </w:rPr>
               <w:fldChar w:fldCharType="begin"/>
             </w:r>
             <w:r>
               <w:rPr>
                 <w:webHidden/>
+                <w:lang w:val="nl-NL"/>
               </w:rPr>
               <w:instrText xml:space="preserve"> PAGEREF _Toc225342869 \h </w:instrText>
             </w:r>
             <w:r>
               <w:rPr>
                 <w:webHidden/>
-              </w:rPr>
-            </w:r>
-            <w:r>
-              <w:rPr>
-                <w:webHidden/>
+                <w:lang w:val="nl-NL"/>
+              </w:rPr>
+            </w:r>
+            <w:r>
+              <w:rPr>
+                <w:webHidden/>
+                <w:lang w:val="nl-NL"/>
               </w:rPr>
               <w:fldChar w:fldCharType="separate"/>
             </w:r>
             <w:r>
               <w:rPr>
                 <w:webHidden/>
+                <w:lang w:val="nl-NL"/>
               </w:rPr>
               <w:t>16</w:t>
             </w:r>
             <w:r>
               <w:rPr>
                 <w:webHidden/>
+                <w:lang w:val="nl-NL"/>
               </w:rPr>
               <w:fldChar w:fldCharType="end"/>
             </w:r>
@@ -2300,7 +2461,7 @@
               <w:kern w:val="2"/>
               <w:sz w:val="24"/>
               <w:szCs w:val="24"/>
-              <w:lang w:val="en-NL" w:eastAsia="en-NL"/>
+              <w:lang w:val="nl-NL" w:eastAsia="en-NL"/>
               <w14:ligatures w14:val="standardContextual"/>
             </w:rPr>
           </w:pPr>
@@ -2308,6 +2469,7 @@
             <w:r>
               <w:rPr>
                 <w:rStyle w:val="Hyperlink"/>
+                <w:lang w:val="nl-NL"/>
               </w:rPr>
               <w:t>6.2.</w:t>
             </w:r>
@@ -2317,7 +2479,7 @@
                 <w:kern w:val="2"/>
                 <w:sz w:val="24"/>
                 <w:szCs w:val="24"/>
-                <w:lang w:val="en-NL" w:eastAsia="en-NL"/>
+                <w:lang w:val="nl-NL" w:eastAsia="en-NL"/>
                 <w14:ligatures w14:val="standardContextual"/>
               </w:rPr>
               <w:tab/>
@@ -2332,41 +2494,48 @@
             <w:r>
               <w:rPr>
                 <w:webHidden/>
+                <w:lang w:val="nl-NL"/>
               </w:rPr>
               <w:tab/>
             </w:r>
             <w:r>
               <w:rPr>
                 <w:webHidden/>
+                <w:lang w:val="nl-NL"/>
               </w:rPr>
               <w:fldChar w:fldCharType="begin"/>
             </w:r>
             <w:r>
               <w:rPr>
                 <w:webHidden/>
+                <w:lang w:val="nl-NL"/>
               </w:rPr>
               <w:instrText xml:space="preserve"> PAGEREF _Toc225342870 \h </w:instrText>
             </w:r>
             <w:r>
               <w:rPr>
                 <w:webHidden/>
-              </w:rPr>
-            </w:r>
-            <w:r>
-              <w:rPr>
-                <w:webHidden/>
+                <w:lang w:val="nl-NL"/>
+              </w:rPr>
+            </w:r>
+            <w:r>
+              <w:rPr>
+                <w:webHidden/>
+                <w:lang w:val="nl-NL"/>
               </w:rPr>
               <w:fldChar w:fldCharType="separate"/>
             </w:r>
             <w:r>
               <w:rPr>
                 <w:webHidden/>
+                <w:lang w:val="nl-NL"/>
               </w:rPr>
               <w:t>17</w:t>
             </w:r>
             <w:r>
               <w:rPr>
                 <w:webHidden/>
+                <w:lang w:val="nl-NL"/>
               </w:rPr>
               <w:fldChar w:fldCharType="end"/>
             </w:r>
@@ -2380,7 +2549,7 @@
               <w:kern w:val="2"/>
               <w:sz w:val="24"/>
               <w:szCs w:val="24"/>
-              <w:lang w:val="en-NL" w:eastAsia="en-NL"/>
+              <w:lang w:val="nl-NL" w:eastAsia="en-NL"/>
               <w14:ligatures w14:val="standardContextual"/>
             </w:rPr>
           </w:pPr>
@@ -2388,6 +2557,7 @@
             <w:r>
               <w:rPr>
                 <w:rStyle w:val="Hyperlink"/>
+                <w:lang w:val="nl-NL"/>
               </w:rPr>
               <w:t>6.3.</w:t>
             </w:r>
@@ -2397,7 +2567,7 @@
                 <w:kern w:val="2"/>
                 <w:sz w:val="24"/>
                 <w:szCs w:val="24"/>
-                <w:lang w:val="en-NL" w:eastAsia="en-NL"/>
+                <w:lang w:val="nl-NL" w:eastAsia="en-NL"/>
                 <w14:ligatures w14:val="standardContextual"/>
               </w:rPr>
               <w:tab/>
@@ -2412,41 +2582,48 @@
             <w:r>
               <w:rPr>
                 <w:webHidden/>
+                <w:lang w:val="nl-NL"/>
               </w:rPr>
               <w:tab/>
             </w:r>
             <w:r>
               <w:rPr>
                 <w:webHidden/>
+                <w:lang w:val="nl-NL"/>
               </w:rPr>
               <w:fldChar w:fldCharType="begin"/>
             </w:r>
             <w:r>
               <w:rPr>
                 <w:webHidden/>
+                <w:lang w:val="nl-NL"/>
               </w:rPr>
               <w:instrText xml:space="preserve"> PAGEREF _Toc225342871 \h </w:instrText>
             </w:r>
             <w:r>
               <w:rPr>
                 <w:webHidden/>
-              </w:rPr>
-            </w:r>
-            <w:r>
-              <w:rPr>
-                <w:webHidden/>
+                <w:lang w:val="nl-NL"/>
+              </w:rPr>
+            </w:r>
+            <w:r>
+              <w:rPr>
+                <w:webHidden/>
+                <w:lang w:val="nl-NL"/>
               </w:rPr>
               <w:fldChar w:fldCharType="separate"/>
             </w:r>
             <w:r>
               <w:rPr>
                 <w:webHidden/>
+                <w:lang w:val="nl-NL"/>
               </w:rPr>
               <w:t>19</w:t>
             </w:r>
             <w:r>
               <w:rPr>
                 <w:webHidden/>
+                <w:lang w:val="nl-NL"/>
               </w:rPr>
               <w:fldChar w:fldCharType="end"/>
             </w:r>
@@ -2460,7 +2637,7 @@
               <w:kern w:val="2"/>
               <w:sz w:val="24"/>
               <w:szCs w:val="24"/>
-              <w:lang w:val="en-NL" w:eastAsia="en-NL"/>
+              <w:lang w:val="nl-NL" w:eastAsia="en-NL"/>
               <w14:ligatures w14:val="standardContextual"/>
             </w:rPr>
           </w:pPr>
@@ -2478,7 +2655,7 @@
                 <w:kern w:val="2"/>
                 <w:sz w:val="24"/>
                 <w:szCs w:val="24"/>
-                <w:lang w:val="en-NL" w:eastAsia="en-NL"/>
+                <w:lang w:val="nl-NL" w:eastAsia="en-NL"/>
                 <w14:ligatures w14:val="standardContextual"/>
               </w:rPr>
               <w:tab/>
@@ -2493,41 +2670,48 @@
             <w:r>
               <w:rPr>
                 <w:webHidden/>
+                <w:lang w:val="nl-NL"/>
               </w:rPr>
               <w:tab/>
             </w:r>
             <w:r>
               <w:rPr>
                 <w:webHidden/>
+                <w:lang w:val="nl-NL"/>
               </w:rPr>
               <w:fldChar w:fldCharType="begin"/>
             </w:r>
             <w:r>
               <w:rPr>
                 <w:webHidden/>
+                <w:lang w:val="nl-NL"/>
               </w:rPr>
               <w:instrText xml:space="preserve"> PAGEREF _Toc225342872 \h </w:instrText>
             </w:r>
             <w:r>
               <w:rPr>
                 <w:webHidden/>
-              </w:rPr>
-            </w:r>
-            <w:r>
-              <w:rPr>
-                <w:webHidden/>
+                <w:lang w:val="nl-NL"/>
+              </w:rPr>
+            </w:r>
+            <w:r>
+              <w:rPr>
+                <w:webHidden/>
+                <w:lang w:val="nl-NL"/>
               </w:rPr>
               <w:fldChar w:fldCharType="separate"/>
             </w:r>
             <w:r>
               <w:rPr>
                 <w:webHidden/>
+                <w:lang w:val="nl-NL"/>
               </w:rPr>
               <w:t>20</w:t>
             </w:r>
             <w:r>
               <w:rPr>
                 <w:webHidden/>
+                <w:lang w:val="nl-NL"/>
               </w:rPr>
               <w:fldChar w:fldCharType="end"/>
             </w:r>
@@ -2541,7 +2725,7 @@
               <w:kern w:val="2"/>
               <w:sz w:val="24"/>
               <w:szCs w:val="24"/>
-              <w:lang w:val="en-NL" w:eastAsia="en-NL"/>
+              <w:lang w:val="nl-NL" w:eastAsia="en-NL"/>
               <w14:ligatures w14:val="standardContextual"/>
             </w:rPr>
           </w:pPr>
@@ -2549,6 +2733,7 @@
             <w:r>
               <w:rPr>
                 <w:rStyle w:val="Hyperlink"/>
+                <w:lang w:val="nl-NL"/>
               </w:rPr>
               <w:t>7.1.</w:t>
             </w:r>
@@ -2558,7 +2743,7 @@
                 <w:kern w:val="2"/>
                 <w:sz w:val="24"/>
                 <w:szCs w:val="24"/>
-                <w:lang w:val="en-NL" w:eastAsia="en-NL"/>
+                <w:lang w:val="nl-NL" w:eastAsia="en-NL"/>
                 <w14:ligatures w14:val="standardContextual"/>
               </w:rPr>
               <w:tab/>
@@ -2573,41 +2758,48 @@
             <w:r>
               <w:rPr>
                 <w:webHidden/>
+                <w:lang w:val="nl-NL"/>
               </w:rPr>
               <w:tab/>
             </w:r>
             <w:r>
               <w:rPr>
                 <w:webHidden/>
+                <w:lang w:val="nl-NL"/>
               </w:rPr>
               <w:fldChar w:fldCharType="begin"/>
             </w:r>
             <w:r>
               <w:rPr>
                 <w:webHidden/>
+                <w:lang w:val="nl-NL"/>
               </w:rPr>
               <w:instrText xml:space="preserve"> PAGEREF _Toc225342873 \h </w:instrText>
             </w:r>
             <w:r>
               <w:rPr>
                 <w:webHidden/>
-              </w:rPr>
-            </w:r>
-            <w:r>
-              <w:rPr>
-                <w:webHidden/>
+                <w:lang w:val="nl-NL"/>
+              </w:rPr>
+            </w:r>
+            <w:r>
+              <w:rPr>
+                <w:webHidden/>
+                <w:lang w:val="nl-NL"/>
               </w:rPr>
               <w:fldChar w:fldCharType="separate"/>
             </w:r>
             <w:r>
               <w:rPr>
                 <w:webHidden/>
+                <w:lang w:val="nl-NL"/>
               </w:rPr>
               <w:t>20</w:t>
             </w:r>
             <w:r>
               <w:rPr>
                 <w:webHidden/>
+                <w:lang w:val="nl-NL"/>
               </w:rPr>
               <w:fldChar w:fldCharType="end"/>
             </w:r>
@@ -2621,7 +2813,7 @@
               <w:kern w:val="2"/>
               <w:sz w:val="24"/>
               <w:szCs w:val="24"/>
-              <w:lang w:val="en-NL" w:eastAsia="en-NL"/>
+              <w:lang w:val="nl-NL" w:eastAsia="en-NL"/>
               <w14:ligatures w14:val="standardContextual"/>
             </w:rPr>
           </w:pPr>
@@ -2629,6 +2821,7 @@
             <w:r>
               <w:rPr>
                 <w:rStyle w:val="Hyperlink"/>
+                <w:lang w:val="nl-NL"/>
               </w:rPr>
               <w:t>7.2.</w:t>
             </w:r>
@@ -2638,7 +2831,7 @@
                 <w:kern w:val="2"/>
                 <w:sz w:val="24"/>
                 <w:szCs w:val="24"/>
-                <w:lang w:val="en-NL" w:eastAsia="en-NL"/>
+                <w:lang w:val="nl-NL" w:eastAsia="en-NL"/>
                 <w14:ligatures w14:val="standardContextual"/>
               </w:rPr>
               <w:tab/>
@@ -2653,41 +2846,48 @@
             <w:r>
               <w:rPr>
                 <w:webHidden/>
+                <w:lang w:val="nl-NL"/>
               </w:rPr>
               <w:tab/>
             </w:r>
             <w:r>
               <w:rPr>
                 <w:webHidden/>
+                <w:lang w:val="nl-NL"/>
               </w:rPr>
               <w:fldChar w:fldCharType="begin"/>
             </w:r>
             <w:r>
               <w:rPr>
                 <w:webHidden/>
+                <w:lang w:val="nl-NL"/>
               </w:rPr>
               <w:instrText xml:space="preserve"> PAGEREF _Toc225342874 \h </w:instrText>
             </w:r>
             <w:r>
               <w:rPr>
                 <w:webHidden/>
-              </w:rPr>
-            </w:r>
-            <w:r>
-              <w:rPr>
-                <w:webHidden/>
+                <w:lang w:val="nl-NL"/>
+              </w:rPr>
+            </w:r>
+            <w:r>
+              <w:rPr>
+                <w:webHidden/>
+                <w:lang w:val="nl-NL"/>
               </w:rPr>
               <w:fldChar w:fldCharType="separate"/>
             </w:r>
             <w:r>
               <w:rPr>
                 <w:webHidden/>
+                <w:lang w:val="nl-NL"/>
               </w:rPr>
               <w:t>20</w:t>
             </w:r>
             <w:r>
               <w:rPr>
                 <w:webHidden/>
+                <w:lang w:val="nl-NL"/>
               </w:rPr>
               <w:fldChar w:fldCharType="end"/>
             </w:r>
@@ -2701,7 +2901,7 @@
               <w:kern w:val="2"/>
               <w:sz w:val="24"/>
               <w:szCs w:val="24"/>
-              <w:lang w:val="en-NL" w:eastAsia="en-NL"/>
+              <w:lang w:val="nl-NL" w:eastAsia="en-NL"/>
               <w14:ligatures w14:val="standardContextual"/>
             </w:rPr>
           </w:pPr>
@@ -2719,7 +2919,7 @@
                 <w:kern w:val="2"/>
                 <w:sz w:val="24"/>
                 <w:szCs w:val="24"/>
-                <w:lang w:val="en-NL" w:eastAsia="en-NL"/>
+                <w:lang w:val="nl-NL" w:eastAsia="en-NL"/>
                 <w14:ligatures w14:val="standardContextual"/>
               </w:rPr>
               <w:tab/>
@@ -2734,41 +2934,48 @@
             <w:r>
               <w:rPr>
                 <w:webHidden/>
+                <w:lang w:val="nl-NL"/>
               </w:rPr>
               <w:tab/>
             </w:r>
             <w:r>
               <w:rPr>
                 <w:webHidden/>
+                <w:lang w:val="nl-NL"/>
               </w:rPr>
               <w:fldChar w:fldCharType="begin"/>
             </w:r>
             <w:r>
               <w:rPr>
                 <w:webHidden/>
+                <w:lang w:val="nl-NL"/>
               </w:rPr>
               <w:instrText xml:space="preserve"> PAGEREF _Toc225342875 \h </w:instrText>
             </w:r>
             <w:r>
               <w:rPr>
                 <w:webHidden/>
-              </w:rPr>
-            </w:r>
-            <w:r>
-              <w:rPr>
-                <w:webHidden/>
+                <w:lang w:val="nl-NL"/>
+              </w:rPr>
+            </w:r>
+            <w:r>
+              <w:rPr>
+                <w:webHidden/>
+                <w:lang w:val="nl-NL"/>
               </w:rPr>
               <w:fldChar w:fldCharType="separate"/>
             </w:r>
             <w:r>
               <w:rPr>
                 <w:webHidden/>
+                <w:lang w:val="nl-NL"/>
               </w:rPr>
               <w:t>22</w:t>
             </w:r>
             <w:r>
               <w:rPr>
                 <w:webHidden/>
+                <w:lang w:val="nl-NL"/>
               </w:rPr>
               <w:fldChar w:fldCharType="end"/>
             </w:r>
@@ -2782,7 +2989,7 @@
               <w:kern w:val="2"/>
               <w:sz w:val="24"/>
               <w:szCs w:val="24"/>
-              <w:lang w:val="en-NL" w:eastAsia="en-NL"/>
+              <w:lang w:val="nl-NL" w:eastAsia="en-NL"/>
               <w14:ligatures w14:val="standardContextual"/>
             </w:rPr>
           </w:pPr>
@@ -2790,6 +2997,7 @@
             <w:r>
               <w:rPr>
                 <w:rStyle w:val="Hyperlink"/>
+                <w:lang w:val="nl-NL"/>
               </w:rPr>
               <w:t>8.1.</w:t>
             </w:r>
@@ -2799,7 +3007,7 @@
                 <w:kern w:val="2"/>
                 <w:sz w:val="24"/>
                 <w:szCs w:val="24"/>
-                <w:lang w:val="en-NL" w:eastAsia="en-NL"/>
+                <w:lang w:val="nl-NL" w:eastAsia="en-NL"/>
                 <w14:ligatures w14:val="standardContextual"/>
               </w:rPr>
               <w:tab/>
@@ -2814,41 +3022,48 @@
             <w:r>
               <w:rPr>
                 <w:webHidden/>
+                <w:lang w:val="nl-NL"/>
               </w:rPr>
               <w:tab/>
             </w:r>
             <w:r>
               <w:rPr>
                 <w:webHidden/>
+                <w:lang w:val="nl-NL"/>
               </w:rPr>
               <w:fldChar w:fldCharType="begin"/>
             </w:r>
             <w:r>
               <w:rPr>
                 <w:webHidden/>
+                <w:lang w:val="nl-NL"/>
               </w:rPr>
               <w:instrText xml:space="preserve"> PAGEREF _Toc225342876 \h </w:instrText>
             </w:r>
             <w:r>
               <w:rPr>
                 <w:webHidden/>
-              </w:rPr>
-            </w:r>
-            <w:r>
-              <w:rPr>
-                <w:webHidden/>
+                <w:lang w:val="nl-NL"/>
+              </w:rPr>
+            </w:r>
+            <w:r>
+              <w:rPr>
+                <w:webHidden/>
+                <w:lang w:val="nl-NL"/>
               </w:rPr>
               <w:fldChar w:fldCharType="separate"/>
             </w:r>
             <w:r>
               <w:rPr>
                 <w:webHidden/>
+                <w:lang w:val="nl-NL"/>
               </w:rPr>
               <w:t>22</w:t>
             </w:r>
             <w:r>
               <w:rPr>
                 <w:webHidden/>
+                <w:lang w:val="nl-NL"/>
               </w:rPr>
               <w:fldChar w:fldCharType="end"/>
             </w:r>
@@ -2862,7 +3077,7 @@
               <w:kern w:val="2"/>
               <w:sz w:val="24"/>
               <w:szCs w:val="24"/>
-              <w:lang w:val="en-NL" w:eastAsia="en-NL"/>
+              <w:lang w:val="nl-NL" w:eastAsia="en-NL"/>
               <w14:ligatures w14:val="standardContextual"/>
             </w:rPr>
           </w:pPr>
@@ -2870,6 +3085,7 @@
             <w:r>
               <w:rPr>
                 <w:rStyle w:val="Hyperlink"/>
+                <w:lang w:val="nl-NL"/>
               </w:rPr>
               <w:t>8.2.</w:t>
             </w:r>
@@ -2879,7 +3095,7 @@
                 <w:kern w:val="2"/>
                 <w:sz w:val="24"/>
                 <w:szCs w:val="24"/>
-                <w:lang w:val="en-NL" w:eastAsia="en-NL"/>
+                <w:lang w:val="nl-NL" w:eastAsia="en-NL"/>
                 <w14:ligatures w14:val="standardContextual"/>
               </w:rPr>
               <w:tab/>
@@ -2894,41 +3110,48 @@
             <w:r>
               <w:rPr>
                 <w:webHidden/>
+                <w:lang w:val="nl-NL"/>
               </w:rPr>
               <w:tab/>
             </w:r>
             <w:r>
               <w:rPr>
                 <w:webHidden/>
+                <w:lang w:val="nl-NL"/>
               </w:rPr>
               <w:fldChar w:fldCharType="begin"/>
             </w:r>
             <w:r>
               <w:rPr>
                 <w:webHidden/>
+                <w:lang w:val="nl-NL"/>
               </w:rPr>
               <w:instrText xml:space="preserve"> PAGEREF _Toc225342877 \h </w:instrText>
             </w:r>
             <w:r>
               <w:rPr>
                 <w:webHidden/>
-              </w:rPr>
-            </w:r>
-            <w:r>
-              <w:rPr>
-                <w:webHidden/>
+                <w:lang w:val="nl-NL"/>
+              </w:rPr>
+            </w:r>
+            <w:r>
+              <w:rPr>
+                <w:webHidden/>
+                <w:lang w:val="nl-NL"/>
               </w:rPr>
               <w:fldChar w:fldCharType="separate"/>
             </w:r>
             <w:r>
               <w:rPr>
                 <w:webHidden/>
+                <w:lang w:val="nl-NL"/>
               </w:rPr>
               <w:t>22</w:t>
             </w:r>
             <w:r>
               <w:rPr>
                 <w:webHidden/>
+                <w:lang w:val="nl-NL"/>
               </w:rPr>
               <w:fldChar w:fldCharType="end"/>
             </w:r>
@@ -2942,7 +3165,7 @@
               <w:kern w:val="2"/>
               <w:sz w:val="24"/>
               <w:szCs w:val="24"/>
-              <w:lang w:val="en-NL" w:eastAsia="en-NL"/>
+              <w:lang w:val="nl-NL" w:eastAsia="en-NL"/>
               <w14:ligatures w14:val="standardContextual"/>
             </w:rPr>
           </w:pPr>
@@ -2960,7 +3183,7 @@
                 <w:kern w:val="2"/>
                 <w:sz w:val="24"/>
                 <w:szCs w:val="24"/>
-                <w:lang w:val="en-NL" w:eastAsia="en-NL"/>
+                <w:lang w:val="nl-NL" w:eastAsia="en-NL"/>
                 <w14:ligatures w14:val="standardContextual"/>
               </w:rPr>
               <w:tab/>
@@ -2975,41 +3198,48 @@
             <w:r>
               <w:rPr>
                 <w:webHidden/>
+                <w:lang w:val="nl-NL"/>
               </w:rPr>
               <w:tab/>
             </w:r>
             <w:r>
               <w:rPr>
                 <w:webHidden/>
+                <w:lang w:val="nl-NL"/>
               </w:rPr>
               <w:fldChar w:fldCharType="begin"/>
             </w:r>
             <w:r>
               <w:rPr>
                 <w:webHidden/>
+                <w:lang w:val="nl-NL"/>
               </w:rPr>
               <w:instrText xml:space="preserve"> PAGEREF _Toc225342878 \h </w:instrText>
             </w:r>
             <w:r>
               <w:rPr>
                 <w:webHidden/>
-              </w:rPr>
-            </w:r>
-            <w:r>
-              <w:rPr>
-                <w:webHidden/>
+                <w:lang w:val="nl-NL"/>
+              </w:rPr>
+            </w:r>
+            <w:r>
+              <w:rPr>
+                <w:webHidden/>
+                <w:lang w:val="nl-NL"/>
               </w:rPr>
               <w:fldChar w:fldCharType="separate"/>
             </w:r>
             <w:r>
               <w:rPr>
                 <w:webHidden/>
+                <w:lang w:val="nl-NL"/>
               </w:rPr>
               <w:t>24</w:t>
             </w:r>
             <w:r>
               <w:rPr>
                 <w:webHidden/>
+                <w:lang w:val="nl-NL"/>
               </w:rPr>
               <w:fldChar w:fldCharType="end"/>
             </w:r>
@@ -3023,7 +3253,7 @@
               <w:kern w:val="2"/>
               <w:sz w:val="24"/>
               <w:szCs w:val="24"/>
-              <w:lang w:val="en-NL" w:eastAsia="en-NL"/>
+              <w:lang w:val="nl-NL" w:eastAsia="en-NL"/>
               <w14:ligatures w14:val="standardContextual"/>
             </w:rPr>
           </w:pPr>
@@ -3038,41 +3268,48 @@
             <w:r>
               <w:rPr>
                 <w:webHidden/>
+                <w:lang w:val="nl-NL"/>
               </w:rPr>
               <w:tab/>
             </w:r>
             <w:r>
               <w:rPr>
                 <w:webHidden/>
+                <w:lang w:val="nl-NL"/>
               </w:rPr>
               <w:fldChar w:fldCharType="begin"/>
             </w:r>
             <w:r>
               <w:rPr>
                 <w:webHidden/>
+                <w:lang w:val="nl-NL"/>
               </w:rPr>
               <w:instrText xml:space="preserve"> PAGEREF _Toc225342879 \h </w:instrText>
             </w:r>
             <w:r>
               <w:rPr>
                 <w:webHidden/>
-              </w:rPr>
-            </w:r>
-            <w:r>
-              <w:rPr>
-                <w:webHidden/>
+                <w:lang w:val="nl-NL"/>
+              </w:rPr>
+            </w:r>
+            <w:r>
+              <w:rPr>
+                <w:webHidden/>
+                <w:lang w:val="nl-NL"/>
               </w:rPr>
               <w:fldChar w:fldCharType="separate"/>
             </w:r>
             <w:r>
               <w:rPr>
                 <w:webHidden/>
+                <w:lang w:val="nl-NL"/>
               </w:rPr>
               <w:t>25</w:t>
             </w:r>
             <w:r>
               <w:rPr>
                 <w:webHidden/>
+                <w:lang w:val="nl-NL"/>
               </w:rPr>
               <w:fldChar w:fldCharType="end"/>
             </w:r>
@@ -3173,7 +3410,13 @@
     </w:p>
     <w:p>
       <w:r>
-        <w:t>Het doel van dit testverslag is om vast te stellen of het CDC component:</w:t>
+        <w:t xml:space="preserve">Het doel van dit testverslag is om </w:t>
+      </w:r>
+      <w:r>
+        <w:t>duidelijk te krijgen</w:t>
+      </w:r>
+      <w:r>
+        <w:t xml:space="preserve"> of het CDC component:</w:t>
       </w:r>
     </w:p>
     <w:p>
@@ -3382,7 +3625,7 @@
         <w:jc w:val="left"/>
       </w:pPr>
       <w:r>
-        <w:t>Dit hoofdstuk beschrijft de context waarin het CDC component is ontwikkeld en hoe het systeem in hoofdlijnen werkt. Dit is nodig om te begrijpen wat er precies getest wordt en waarom bepaalde keuzes zijn gemaakt.</w:t>
+        <w:t>Dit hoofdstuk beschrijft de context waarin het CDC component is ontwikkeld en hoe het systeem werkt. Dit is nodig om te begrijpen wat er precies getest wordt en waarom bepaalde keuzes zijn gemaakt.</w:t>
       </w:r>
     </w:p>
     <w:p>
@@ -3406,7 +3649,22 @@
     </w:p>
     <w:p>
       <w:r>
-        <w:t>Het CDC component is ontwikkeld om wijzigingen in data inzichtelijk te maken binnen een Snowflake omgeving. In Snowflake worden primaire en vreemde sleutels wel opgeslagen, maar niet actief afgedwongen. Hierdoor kunnen fouten zoals duplicaten of inconsistente data ontstaan zonder dat het systeem dit blokkeert.</w:t>
+        <w:t>Het CDC component is ontwikkeld om wijzigingen in data inzichtelijk te maken binnen een Snowflake omgeving. In Snowflake worden</w:t>
+      </w:r>
+      <w:r>
+        <w:t xml:space="preserve"> regels als</w:t>
+      </w:r>
+      <w:r>
+        <w:t xml:space="preserve"> primaire </w:t>
+      </w:r>
+      <w:r>
+        <w:t xml:space="preserve">sleutels </w:t>
+      </w:r>
+      <w:r>
+        <w:t xml:space="preserve">opgeslagen, maar niet afgedwongen. Hierdoor kunnen fouten zoals duplicaten of inconsistente data ontstaan zonder dat het systeem dit </w:t>
+      </w:r>
+      <w:r>
+        <w:t>tegenhoudt.</w:t>
       </w:r>
     </w:p>
     <w:p>
@@ -3437,6 +3695,9 @@
       <w:r>
         <w:t>Wijzigingen te detecteren op basis van een primary key en een hashwaarde</w:t>
       </w:r>
+      <w:r>
+        <w:t xml:space="preserve"> (vingerafdruk)</w:t>
+      </w:r>
     </w:p>
     <w:p>
       <w:pPr>
@@ -3447,7 +3708,10 @@
         </w:numPr>
       </w:pPr>
       <w:r>
-        <w:t>Automatisch te bepalen of er sprake is van een insert, update of delete</w:t>
+        <w:t>Automatisch te bepalen of er een insert, update of delete</w:t>
+      </w:r>
+      <w:r>
+        <w:t xml:space="preserve"> heeft plaatsgevonden</w:t>
       </w:r>
     </w:p>
     <w:p>
@@ -3604,7 +3868,16 @@
         </w:numPr>
       </w:pPr>
       <w:r>
-        <w:t xml:space="preserve">Voor elke rij wordt een hashwaarde berekend </w:t>
+        <w:t>Voor elke rij wordt een hash</w:t>
+      </w:r>
+      <w:r>
+        <w:t xml:space="preserve"> (vingerafdruk)</w:t>
+      </w:r>
+      <w:r>
+        <w:t xml:space="preserve"> </w:t>
+      </w:r>
+      <w:r>
+        <w:t>gegenereerd</w:t>
       </w:r>
     </w:p>
     <w:p>
@@ -3729,7 +4002,19 @@
     </w:p>
     <w:p>
       <w:r>
-        <w:t>Dit hoofdstuk beschrijft hoe het testen is aangepakt en op basis van welke methode en keuzes de testen zijn uitgevoerd. De teststrategie bepaalt de structuur van het testen en zorgt ervoor dat de resultaten onderbouwd en reproduceerbaar zijn.</w:t>
+        <w:t>Dit hoofdstuk beschrijft hoe het testen is aangepakt en op basis van welke methode en keuzes de test</w:t>
+      </w:r>
+      <w:r>
+        <w:t>s</w:t>
+      </w:r>
+      <w:r>
+        <w:t xml:space="preserve"> zijn uitgevoerd. De teststrategie bepaalt de structuur</w:t>
+      </w:r>
+      <w:r>
+        <w:t xml:space="preserve"> en wijze</w:t>
+      </w:r>
+      <w:r>
+        <w:t xml:space="preserve"> van het testen en zorgt ervoor dat de resultaten onderbouwd en reproduceerbaar zijn.</w:t>
       </w:r>
     </w:p>
     <w:p>
@@ -3750,7 +4035,19 @@
     </w:p>
     <w:p>
       <w:r>
-        <w:t>Het doel van de teststrategie is om vast te stellen of het CDC component:</w:t>
+        <w:t>Het doel van de</w:t>
+      </w:r>
+      <w:r>
+        <w:t>ze</w:t>
+      </w:r>
+      <w:r>
+        <w:t xml:space="preserve"> teststrategie is om </w:t>
+      </w:r>
+      <w:r>
+        <w:t xml:space="preserve">vast te stellen </w:t>
+      </w:r>
+      <w:r>
+        <w:t>of het CDC component:</w:t>
       </w:r>
     </w:p>
     <w:p>
@@ -3764,6 +4061,9 @@
       <w:r>
         <w:t>Functioneel correct werkt</w:t>
       </w:r>
+      <w:r>
+        <w:t xml:space="preserve"> volgens de eisen</w:t>
+      </w:r>
     </w:p>
     <w:p>
       <w:pPr>
@@ -3798,7 +4098,13 @@
         </w:numPr>
       </w:pPr>
       <w:r>
-        <w:t>Schaalbaar is bij groeiende datasets</w:t>
+        <w:t xml:space="preserve">Schaalbaar is </w:t>
+      </w:r>
+      <w:r>
+        <w:t>met verschillende</w:t>
+      </w:r>
+      <w:r>
+        <w:t xml:space="preserve"> datasets</w:t>
       </w:r>
     </w:p>
     <w:p>
@@ -3827,7 +4133,13 @@
         <w:jc w:val="left"/>
       </w:pPr>
       <w:r>
-        <w:t xml:space="preserve">Er is gekozen voor een aanpak gebaseerd op concepten uit </w:t>
+        <w:t xml:space="preserve">Er is gekozen voor een aanpak gebaseerd op </w:t>
+      </w:r>
+      <w:r>
+        <w:t>richtlijnen</w:t>
+      </w:r>
+      <w:r>
+        <w:t xml:space="preserve"> uit </w:t>
       </w:r>
       <w:r>
         <w:rPr>
@@ -3854,7 +4166,13 @@
         <w:t xml:space="preserve"> </w:t>
       </w:r>
       <w:r>
-        <w:t xml:space="preserve">Omdat dit project zich richt op data, is de aanpak aangevuld met een data specifieke benadering. Volgens </w:t>
+        <w:t>Omdat dit project zich richt op data, is de aanpak aangevuld met een data specifieke</w:t>
+      </w:r>
+      <w:r>
+        <w:t xml:space="preserve"> aanpak</w:t>
+      </w:r>
+      <w:r>
+        <w:t xml:space="preserve">. Volgens </w:t>
       </w:r>
       <w:r>
         <w:rPr>
@@ -3984,7 +4302,13 @@
     </w:p>
     <w:p>
       <w:r>
-        <w:t>Niet elke dimensie is even belangrijk. Binnen dit project ligt de nadruk op:</w:t>
+        <w:t xml:space="preserve">Niet elke dimensie is even belangrijk. Binnen </w:t>
+      </w:r>
+      <w:r>
+        <w:t>het</w:t>
+      </w:r>
+      <w:r>
+        <w:t xml:space="preserve"> project ligt de nadruk op:</w:t>
       </w:r>
     </w:p>
     <w:p>
@@ -4031,9 +4355,9 @@
       </w:tblPr>
       <w:tblGrid>
         <w:gridCol w:w="1517"/>
-        <w:gridCol w:w="1566"/>
-        <w:gridCol w:w="4070"/>
-        <w:gridCol w:w="3044"/>
+        <w:gridCol w:w="1575"/>
+        <w:gridCol w:w="4019"/>
+        <w:gridCol w:w="3086"/>
       </w:tblGrid>
       <w:tr>
         <w:trPr>
@@ -4167,13 +4491,13 @@
               <w:cnfStyle w:val="000000000000" w:firstRow="0" w:lastRow="0" w:firstColumn="0" w:lastColumn="0" w:oddVBand="0" w:evenVBand="0" w:oddHBand="0" w:evenHBand="0" w:firstRowFirstColumn="0" w:firstRowLastColumn="0" w:lastRowFirstColumn="0" w:lastRowLastColumn="0"/>
             </w:pPr>
             <w:r>
-              <w:t>Het component moet alle</w:t>
-            </w:r>
-            <w:r>
-              <w:t xml:space="preserve"> (valide)</w:t>
-            </w:r>
-            <w:r>
-              <w:t xml:space="preserve"> records correct overnemen van staging naar target</w:t>
+              <w:t>Het component moet alle (valide) r</w:t>
+            </w:r>
+            <w:r>
+              <w:t xml:space="preserve">ijen </w:t>
+            </w:r>
+            <w:r>
+              <w:t>correct overnemen van staging naar target</w:t>
             </w:r>
             <w:r>
               <w:t>.</w:t>
@@ -4247,7 +4571,13 @@
               <w:t xml:space="preserve">duplicaten </w:t>
             </w:r>
             <w:r>
-              <w:t>is een kernfunctie van het component</w:t>
+              <w:t>is een kern</w:t>
+            </w:r>
+            <w:r>
+              <w:t xml:space="preserve"> </w:t>
+            </w:r>
+            <w:r>
+              <w:t>functie van het component</w:t>
             </w:r>
           </w:p>
         </w:tc>
@@ -4364,7 +4694,13 @@
         <w:jc w:val="left"/>
       </w:pPr>
       <w:r>
-        <w:t>In dit hoofdstuk wordt beschreven hoe de testen zijn ingericht. Het testontwerp bepaalt wat er getest wordt en op welke manier dit gebeurt. Hierbij is de teststrategie vertaald naar scenario’s, testdata en testcases.</w:t>
+        <w:t>In dit hoofdstuk wordt beschreven hoe de test</w:t>
+      </w:r>
+      <w:r>
+        <w:t>s zijn opgebouwd</w:t>
+      </w:r>
+      <w:r>
+        <w:t>. Het testontwerp bepaalt wat er getest wordt en op welke manier dit gebeurt. Hierbij is de teststrategie vertaald naar scenario’s, testdata en testcases.</w:t>
       </w:r>
     </w:p>
     <w:p>
@@ -4393,13 +4729,73 @@
         <w:rPr>
           <w:lang w:eastAsia="en-NL"/>
         </w:rPr>
-        <w:t>De testen zijn opgebouwd uit verschillende scenario’s die aansluiten op de werking van het CDC component. Deze scenario’s dekken de belangrijkste situaties die in de praktijk kunnen voorkomen.</w:t>
+        <w:t>De test</w:t>
       </w:r>
       <w:r>
         <w:rPr>
           <w:lang w:eastAsia="en-NL"/>
         </w:rPr>
-        <w:t xml:space="preserve"> Deze scenario’s zijn gebaseerd op de kernfunctionaliteit van het CDC component en de data quality dimensies.</w:t>
+        <w:t>s</w:t>
+      </w:r>
+      <w:r>
+        <w:rPr>
+          <w:lang w:eastAsia="en-NL"/>
+        </w:rPr>
+        <w:t xml:space="preserve"> zijn opgebouwd uit verschillende scenario</w:t>
+      </w:r>
+      <w:r>
+        <w:rPr>
+          <w:lang w:eastAsia="en-NL"/>
+        </w:rPr>
+        <w:t>’</w:t>
+      </w:r>
+      <w:r>
+        <w:rPr>
+          <w:lang w:eastAsia="en-NL"/>
+        </w:rPr>
+        <w:t xml:space="preserve">s die </w:t>
+      </w:r>
+      <w:r>
+        <w:rPr>
+          <w:lang w:eastAsia="en-NL"/>
+        </w:rPr>
+        <w:t xml:space="preserve">aansluiten </w:t>
+      </w:r>
+      <w:r>
+        <w:rPr>
+          <w:lang w:eastAsia="en-NL"/>
+        </w:rPr>
+        <w:t xml:space="preserve">op </w:t>
+      </w:r>
+      <w:r>
+        <w:rPr>
+          <w:lang w:eastAsia="en-NL"/>
+        </w:rPr>
+        <w:t xml:space="preserve">de werking van het </w:t>
+      </w:r>
+      <w:r>
+        <w:rPr>
+          <w:lang w:eastAsia="en-NL"/>
+        </w:rPr>
+        <w:t>CDC component. Deze scenario’s dekken de belangrijkste situaties die in de praktijk kunnen voorkomen.</w:t>
+      </w:r>
+      <w:r>
+        <w:rPr>
+          <w:lang w:eastAsia="en-NL"/>
+        </w:rPr>
+        <w:t xml:space="preserve"> Deze scenario’s zijn gebaseerd op de kernfunctionaliteit van het CDC component en de </w:t>
+      </w:r>
+      <w:r>
+        <w:rPr>
+          <w:lang w:eastAsia="en-NL"/>
+        </w:rPr>
+        <w:t xml:space="preserve">6 </w:t>
+      </w:r>
+      <w:r>
+        <w:rPr>
+          <w:lang w:eastAsia="en-NL"/>
+        </w:rPr>
+        <w:t>data quality dimensies.</w:t>
       </w:r>
     </w:p>
     <w:tbl>
@@ -4409,9 +4805,9 @@
         <w:tblLook w:val="04A0" w:firstRow="1" w:lastRow="0" w:firstColumn="1" w:lastColumn="0" w:noHBand="0" w:noVBand="1"/>
       </w:tblPr>
       <w:tblGrid>
-        <w:gridCol w:w="1897"/>
-        <w:gridCol w:w="3593"/>
-        <w:gridCol w:w="4707"/>
+        <w:gridCol w:w="1924"/>
+        <w:gridCol w:w="3611"/>
+        <w:gridCol w:w="4662"/>
       </w:tblGrid>
       <w:tr>
         <w:trPr>
@@ -4526,7 +4922,19 @@
               <w:rPr>
                 <w:lang w:eastAsia="en-NL"/>
               </w:rPr>
-              <w:t>Nieuwe records komen voor het eerst in staging voor</w:t>
+              <w:t xml:space="preserve">Nieuwe </w:t>
+            </w:r>
+            <w:r>
+              <w:rPr>
+                <w:lang w:eastAsia="en-NL"/>
+              </w:rPr>
+              <w:t>rijen</w:t>
+            </w:r>
+            <w:r>
+              <w:rPr>
+                <w:lang w:eastAsia="en-NL"/>
+              </w:rPr>
+              <w:t xml:space="preserve"> komen voor het eerst in staging voor</w:t>
             </w:r>
           </w:p>
         </w:tc>
@@ -4547,7 +4955,25 @@
               <w:rPr>
                 <w:lang w:eastAsia="en-NL"/>
               </w:rPr>
-              <w:t>Records worden als nieuwe actieve records toegevoegd aan target</w:t>
+              <w:t>Rijen</w:t>
+            </w:r>
+            <w:r>
+              <w:rPr>
+                <w:lang w:eastAsia="en-NL"/>
+              </w:rPr>
+              <w:t xml:space="preserve"> worden als nieuwe actieve </w:t>
+            </w:r>
+            <w:r>
+              <w:rPr>
+                <w:lang w:eastAsia="en-NL"/>
+              </w:rPr>
+              <w:t>rijen</w:t>
+            </w:r>
+            <w:r>
+              <w:rPr>
+                <w:lang w:eastAsia="en-NL"/>
+              </w:rPr>
+              <w:t xml:space="preserve"> toegevoegd aan target</w:t>
             </w:r>
           </w:p>
         </w:tc>
@@ -4591,7 +5017,31 @@
               <w:rPr>
                 <w:lang w:eastAsia="en-NL"/>
               </w:rPr>
-              <w:t>Een bestaand record wijzigt en de update-strategie staat op HISTORY</w:t>
+              <w:t xml:space="preserve">Een bestaand </w:t>
+            </w:r>
+            <w:r>
+              <w:rPr>
+                <w:lang w:eastAsia="en-NL"/>
+              </w:rPr>
+              <w:t>rij</w:t>
+            </w:r>
+            <w:r>
+              <w:rPr>
+                <w:lang w:eastAsia="en-NL"/>
+              </w:rPr>
+              <w:t xml:space="preserve"> wijzigt en de update</w:t>
+            </w:r>
+            <w:r>
+              <w:rPr>
+                <w:lang w:eastAsia="en-NL"/>
+              </w:rPr>
+              <w:t xml:space="preserve"> </w:t>
+            </w:r>
+            <w:r>
+              <w:rPr>
+                <w:lang w:eastAsia="en-NL"/>
+              </w:rPr>
+              <w:t>strategie staat op HISTORY</w:t>
             </w:r>
           </w:p>
         </w:tc>
@@ -4656,7 +5106,31 @@
               <w:rPr>
                 <w:lang w:eastAsia="en-NL"/>
               </w:rPr>
-              <w:t>Een record verdwijnt uit staging en delete-strategie staat op SOFT</w:t>
+              <w:t xml:space="preserve">Een </w:t>
+            </w:r>
+            <w:r>
+              <w:rPr>
+                <w:lang w:eastAsia="en-NL"/>
+              </w:rPr>
+              <w:t>rij</w:t>
+            </w:r>
+            <w:r>
+              <w:rPr>
+                <w:lang w:eastAsia="en-NL"/>
+              </w:rPr>
+              <w:t xml:space="preserve"> verdwijnt uit staging en delete</w:t>
+            </w:r>
+            <w:r>
+              <w:rPr>
+                <w:lang w:eastAsia="en-NL"/>
+              </w:rPr>
+              <w:t xml:space="preserve"> </w:t>
+            </w:r>
+            <w:r>
+              <w:rPr>
+                <w:lang w:eastAsia="en-NL"/>
+              </w:rPr>
+              <w:t>strategie staat op SOFT</w:t>
             </w:r>
           </w:p>
         </w:tc>
@@ -4677,7 +5151,19 @@
               <w:rPr>
                 <w:lang w:eastAsia="en-NL"/>
               </w:rPr>
-              <w:t>Record blijft bestaan in target, maar wordt inactief gezet met einddatum en CDC operatie D</w:t>
+              <w:t>R</w:t>
+            </w:r>
+            <w:r>
+              <w:rPr>
+                <w:lang w:eastAsia="en-NL"/>
+              </w:rPr>
+              <w:t>ij</w:t>
+            </w:r>
+            <w:r>
+              <w:rPr>
+                <w:lang w:eastAsia="en-NL"/>
+              </w:rPr>
+              <w:t xml:space="preserve"> blijft bestaan in target, maar wordt inactief gezet met einddatum en CDC operatie D</w:t>
             </w:r>
           </w:p>
         </w:tc>
@@ -4851,7 +5337,31 @@
               <w:rPr>
                 <w:lang w:eastAsia="en-NL"/>
               </w:rPr>
-              <w:t>Een bestaand record wijzigt en update-strategie staat op OVERWRITE</w:t>
+              <w:t xml:space="preserve">Een bestaand </w:t>
+            </w:r>
+            <w:r>
+              <w:rPr>
+                <w:lang w:eastAsia="en-NL"/>
+              </w:rPr>
+              <w:t>rij</w:t>
+            </w:r>
+            <w:r>
+              <w:rPr>
+                <w:lang w:eastAsia="en-NL"/>
+              </w:rPr>
+              <w:t xml:space="preserve"> wijzigt en update</w:t>
+            </w:r>
+            <w:r>
+              <w:rPr>
+                <w:lang w:eastAsia="en-NL"/>
+              </w:rPr>
+              <w:t xml:space="preserve"> </w:t>
+            </w:r>
+            <w:r>
+              <w:rPr>
+                <w:lang w:eastAsia="en-NL"/>
+              </w:rPr>
+              <w:t>strategie staat op OVERWRITE</w:t>
             </w:r>
           </w:p>
         </w:tc>
@@ -4872,7 +5382,25 @@
               <w:rPr>
                 <w:lang w:eastAsia="en-NL"/>
               </w:rPr>
-              <w:t>Bestaande actieve record wordt overschreven, zonder extra historie-regel</w:t>
+              <w:t xml:space="preserve">Bestaande actieve </w:t>
+            </w:r>
+            <w:r>
+              <w:rPr>
+                <w:lang w:eastAsia="en-NL"/>
+              </w:rPr>
+              <w:t>rij</w:t>
+            </w:r>
+            <w:r>
+              <w:rPr>
+                <w:lang w:eastAsia="en-NL"/>
+              </w:rPr>
+              <w:t xml:space="preserve"> wordt overschreven, zonder extra historie</w:t>
+            </w:r>
+            <w:r>
+              <w:rPr>
+                <w:lang w:eastAsia="en-NL"/>
+              </w:rPr>
+              <w:t xml:space="preserve"> rij</w:t>
             </w:r>
           </w:p>
         </w:tc>
@@ -4916,7 +5444,31 @@
               <w:rPr>
                 <w:lang w:eastAsia="en-NL"/>
               </w:rPr>
-              <w:t>Een record verdwijnt uit staging en delete-strategie staat op HARD</w:t>
+              <w:t xml:space="preserve">Een </w:t>
+            </w:r>
+            <w:r>
+              <w:rPr>
+                <w:lang w:eastAsia="en-NL"/>
+              </w:rPr>
+              <w:t>rij</w:t>
+            </w:r>
+            <w:r>
+              <w:rPr>
+                <w:lang w:eastAsia="en-NL"/>
+              </w:rPr>
+              <w:t xml:space="preserve"> verdwijnt uit staging en delete</w:t>
+            </w:r>
+            <w:r>
+              <w:rPr>
+                <w:lang w:eastAsia="en-NL"/>
+              </w:rPr>
+              <w:t xml:space="preserve"> </w:t>
+            </w:r>
+            <w:r>
+              <w:rPr>
+                <w:lang w:eastAsia="en-NL"/>
+              </w:rPr>
+              <w:t>strategie staat op HARD</w:t>
             </w:r>
           </w:p>
         </w:tc>
@@ -4937,7 +5489,13 @@
               <w:rPr>
                 <w:lang w:eastAsia="en-NL"/>
               </w:rPr>
-              <w:t>Record wordt fysiek verwijderd uit target</w:t>
+              <w:t>Rij</w:t>
+            </w:r>
+            <w:r>
+              <w:rPr>
+                <w:lang w:eastAsia="en-NL"/>
+              </w:rPr>
+              <w:t xml:space="preserve"> wordt fysiek verwijderd uit target</w:t>
             </w:r>
           </w:p>
         </w:tc>
@@ -5121,7 +5679,13 @@
               <w:cnfStyle w:val="000000000000" w:firstRow="0" w:lastRow="0" w:firstColumn="0" w:lastColumn="0" w:oddVBand="0" w:evenVBand="0" w:oddHBand="0" w:evenHBand="0" w:firstRowFirstColumn="0" w:firstRowLastColumn="0" w:lastRowFirstColumn="0" w:lastRowLastColumn="0"/>
             </w:pPr>
             <w:r>
-              <w:t>Of nieuwe records correct worden toegevoegd en gelogd</w:t>
+              <w:t xml:space="preserve">Of nieuwe </w:t>
+            </w:r>
+            <w:r>
+              <w:t>rijen</w:t>
+            </w:r>
+            <w:r>
+              <w:t xml:space="preserve"> correct worden toegevoegd en gelogd</w:t>
             </w:r>
           </w:p>
         </w:tc>
@@ -5243,7 +5807,13 @@
               <w:cnfStyle w:val="000000000000" w:firstRow="0" w:lastRow="0" w:firstColumn="0" w:lastColumn="0" w:oddVBand="0" w:evenVBand="0" w:oddHBand="0" w:evenHBand="0" w:firstRowFirstColumn="0" w:firstRowLastColumn="0" w:lastRowFirstColumn="0" w:lastRowLastColumn="0"/>
             </w:pPr>
             <w:r>
-              <w:t>Of records logisch verwijderd worden en als delete worden gemarkeerd</w:t>
+              <w:t xml:space="preserve">Of </w:t>
+            </w:r>
+            <w:r>
+              <w:t>rijen</w:t>
+            </w:r>
+            <w:r>
+              <w:t xml:space="preserve"> logisch verwijderd worden en als delete worden gemarkeerd</w:t>
             </w:r>
           </w:p>
         </w:tc>
@@ -5302,52 +5872,10 @@
             <w:pPr>
               <w:jc w:val="left"/>
               <w:cnfStyle w:val="000000000000" w:firstRow="0" w:lastRow="0" w:firstColumn="0" w:lastColumn="0" w:oddVBand="0" w:evenVBand="0" w:oddHBand="0" w:evenHBand="0" w:firstRowFirstColumn="0" w:firstRowLastColumn="0" w:lastRowFirstColumn="0" w:lastRowLastColumn="0"/>
-              <w:rPr>
-                <w:lang w:val="en-US"/>
-              </w:rPr>
-            </w:pPr>
-            <w:r>
-              <w:rPr>
-                <w:lang w:val="en-US"/>
-              </w:rPr>
-              <w:t xml:space="preserve">Of duplicate inserts, duplicate updates </w:t>
-            </w:r>
-            <w:proofErr w:type="spellStart"/>
-            <w:r>
-              <w:rPr>
-                <w:lang w:val="en-US"/>
-              </w:rPr>
-              <w:t>en</w:t>
-            </w:r>
-            <w:proofErr w:type="spellEnd"/>
-            <w:r>
-              <w:rPr>
-                <w:lang w:val="en-US"/>
-              </w:rPr>
-              <w:t xml:space="preserve"> primary key errors </w:t>
-            </w:r>
-            <w:proofErr w:type="spellStart"/>
-            <w:r>
-              <w:rPr>
-                <w:lang w:val="en-US"/>
-              </w:rPr>
-              <w:t>worden</w:t>
-            </w:r>
-            <w:proofErr w:type="spellEnd"/>
-            <w:r>
-              <w:rPr>
-                <w:lang w:val="en-US"/>
-              </w:rPr>
-              <w:t xml:space="preserve"> </w:t>
-            </w:r>
-            <w:proofErr w:type="spellStart"/>
-            <w:r>
-              <w:rPr>
-                <w:lang w:val="en-US"/>
-              </w:rPr>
-              <w:t>gedetecteerd</w:t>
-            </w:r>
-            <w:proofErr w:type="spellEnd"/>
+            </w:pPr>
+            <w:r>
+              <w:t>Of duplicate inserts, duplicate updates en primary key errors worden gedetecteerd</w:t>
+            </w:r>
           </w:p>
         </w:tc>
         <w:tc>
@@ -5407,7 +5935,10 @@
               <w:cnfStyle w:val="000000000000" w:firstRow="0" w:lastRow="0" w:firstColumn="0" w:lastColumn="0" w:oddVBand="0" w:evenVBand="0" w:oddHBand="0" w:evenHBand="0" w:firstRowFirstColumn="0" w:firstRowLastColumn="0" w:lastRowFirstColumn="0" w:lastRowLastColumn="0"/>
             </w:pPr>
             <w:r>
-              <w:t>Of een mislukte run correct als FAILED wordt vastgelegd</w:t>
+              <w:t xml:space="preserve">Of een mislukte run correct als FAILED wordt </w:t>
+            </w:r>
+            <w:r>
+              <w:t>gelogd</w:t>
             </w:r>
           </w:p>
         </w:tc>
@@ -5529,7 +6060,13 @@
               <w:cnfStyle w:val="000000000000" w:firstRow="0" w:lastRow="0" w:firstColumn="0" w:lastColumn="0" w:oddVBand="0" w:evenVBand="0" w:oddHBand="0" w:evenHBand="0" w:firstRowFirstColumn="0" w:firstRowLastColumn="0" w:lastRowFirstColumn="0" w:lastRowLastColumn="0"/>
             </w:pPr>
             <w:r>
-              <w:t>Of records fysiek uit target verdwijnen</w:t>
+              <w:t xml:space="preserve">Of </w:t>
+            </w:r>
+            <w:r>
+              <w:t>rijen</w:t>
+            </w:r>
+            <w:r>
+              <w:t xml:space="preserve"> fysiek uit target verdwijnen</w:t>
             </w:r>
           </w:p>
         </w:tc>
@@ -5552,7 +6089,37 @@
     <w:p/>
     <w:p>
       <w:r>
-        <w:t>Met deze scenario’s is niet alleen getest of het CDC component technisch werkt, maar ook of het systeem zich correct gedraagt onder verschillende strategieën en foutomstandigheden. Daardoor kan later in de resultaten en evaluatie worden beoordeeld of de oplossing voldoet aan de functionele eisen en of de datakwaliteit voldoende wordt bewaakt.</w:t>
+        <w:t xml:space="preserve">Met deze scenario’s is niet alleen getest of het CDC component </w:t>
+      </w:r>
+      <w:r>
+        <w:t>functioneel</w:t>
+      </w:r>
+      <w:r>
+        <w:t xml:space="preserve"> werkt, maar ook of het</w:t>
+      </w:r>
+      <w:r>
+        <w:t xml:space="preserve"> component</w:t>
+      </w:r>
+      <w:r>
+        <w:t xml:space="preserve"> zich correct gedraagt </w:t>
+      </w:r>
+      <w:r>
+        <w:t>met de</w:t>
+      </w:r>
+      <w:r>
+        <w:t xml:space="preserve"> verschillende strategie</w:t>
+      </w:r>
+      <w:r>
+        <w:t>e</w:t>
+      </w:r>
+      <w:r>
+        <w:t>n en</w:t>
+      </w:r>
+      <w:r>
+        <w:t xml:space="preserve"> fouten</w:t>
+      </w:r>
+      <w:r>
+        <w:t>. Daardoor kan later in de resultaten en evaluatie worden beoordeeld of de oplossing voldoet aan de functionele eisen.</w:t>
       </w:r>
     </w:p>
     <w:p>
@@ -5779,9 +6346,9 @@
         <w:tblLook w:val="04A0" w:firstRow="1" w:lastRow="0" w:firstColumn="1" w:lastColumn="0" w:noHBand="0" w:noVBand="1"/>
       </w:tblPr>
       <w:tblGrid>
-        <w:gridCol w:w="1909"/>
-        <w:gridCol w:w="4410"/>
-        <w:gridCol w:w="3878"/>
+        <w:gridCol w:w="1959"/>
+        <w:gridCol w:w="4397"/>
+        <w:gridCol w:w="3841"/>
       </w:tblGrid>
       <w:tr>
         <w:trPr>
@@ -5876,29 +6443,15 @@
             <w:pPr>
               <w:jc w:val="left"/>
               <w:cnfStyle w:val="000000000000" w:firstRow="0" w:lastRow="0" w:firstColumn="0" w:lastColumn="0" w:oddVBand="0" w:evenVBand="0" w:oddHBand="0" w:evenHBand="0" w:firstRowFirstColumn="0" w:firstRowLastColumn="0" w:lastRowFirstColumn="0" w:lastRowLastColumn="0"/>
-              <w:rPr>
-                <w:lang w:val="en-US"/>
-              </w:rPr>
-            </w:pPr>
-            <w:r>
-              <w:rPr>
-                <w:lang w:val="en-US"/>
-              </w:rPr>
-              <w:t xml:space="preserve">Nieuwe employee records met </w:t>
-            </w:r>
-            <w:proofErr w:type="spellStart"/>
-            <w:r>
-              <w:rPr>
-                <w:lang w:val="en-US"/>
-              </w:rPr>
-              <w:t>unieke</w:t>
-            </w:r>
-            <w:proofErr w:type="spellEnd"/>
-            <w:r>
-              <w:rPr>
-                <w:lang w:val="en-US"/>
-              </w:rPr>
-              <w:t xml:space="preserve"> primary key</w:t>
+            </w:pPr>
+            <w:r>
+              <w:t xml:space="preserve">Nieuwe employee </w:t>
+            </w:r>
+            <w:r>
+              <w:t>rijen</w:t>
+            </w:r>
+            <w:r>
+              <w:t xml:space="preserve"> met unieke primary key</w:t>
             </w:r>
           </w:p>
         </w:tc>
@@ -5913,7 +6466,13 @@
               <w:cnfStyle w:val="000000000000" w:firstRow="0" w:lastRow="0" w:firstColumn="0" w:lastColumn="0" w:oddVBand="0" w:evenVBand="0" w:oddHBand="0" w:evenHBand="0" w:firstRowFirstColumn="0" w:firstRowLastColumn="0" w:lastRowFirstColumn="0" w:lastRowLastColumn="0"/>
             </w:pPr>
             <w:r>
-              <w:t>Controleren of nieuwe records worden toegevoegd</w:t>
+              <w:t xml:space="preserve">Controleren of nieuwe </w:t>
+            </w:r>
+            <w:r>
+              <w:t>rijen</w:t>
+            </w:r>
+            <w:r>
+              <w:t xml:space="preserve"> worden toegevoegd</w:t>
             </w:r>
           </w:p>
         </w:tc>
@@ -5945,7 +6504,13 @@
               <w:cnfStyle w:val="000000000000" w:firstRow="0" w:lastRow="0" w:firstColumn="0" w:lastColumn="0" w:oddVBand="0" w:evenVBand="0" w:oddHBand="0" w:evenHBand="0" w:firstRowFirstColumn="0" w:firstRowLastColumn="0" w:lastRowFirstColumn="0" w:lastRowLastColumn="0"/>
             </w:pPr>
             <w:r>
-              <w:t>Bestaand record met gewijzigde salary</w:t>
+              <w:t xml:space="preserve">Bestaand </w:t>
+            </w:r>
+            <w:r>
+              <w:t>rij</w:t>
+            </w:r>
+            <w:r>
+              <w:t xml:space="preserve"> met gewijzigde salary</w:t>
             </w:r>
           </w:p>
         </w:tc>
@@ -5992,7 +6557,10 @@
               <w:cnfStyle w:val="000000000000" w:firstRow="0" w:lastRow="0" w:firstColumn="0" w:lastColumn="0" w:oddVBand="0" w:evenVBand="0" w:oddHBand="0" w:evenHBand="0" w:firstRowFirstColumn="0" w:firstRowLastColumn="0" w:lastRowFirstColumn="0" w:lastRowLastColumn="0"/>
             </w:pPr>
             <w:r>
-              <w:t>Record ontbreekt in staging maar staat nog in target</w:t>
+              <w:t>Rij</w:t>
+            </w:r>
+            <w:r>
+              <w:t xml:space="preserve"> ontbreekt in staging maar staat nog in target</w:t>
             </w:r>
           </w:p>
         </w:tc>
@@ -6007,7 +6575,13 @@
               <w:cnfStyle w:val="000000000000" w:firstRow="0" w:lastRow="0" w:firstColumn="0" w:lastColumn="0" w:oddVBand="0" w:evenVBand="0" w:oddHBand="0" w:evenHBand="0" w:firstRowFirstColumn="0" w:firstRowLastColumn="0" w:lastRowFirstColumn="0" w:lastRowLastColumn="0"/>
             </w:pPr>
             <w:r>
-              <w:t>Controleren of record inactief wordt gemaakt</w:t>
+              <w:t xml:space="preserve">Controleren of </w:t>
+            </w:r>
+            <w:r>
+              <w:t>rij</w:t>
+            </w:r>
+            <w:r>
+              <w:t xml:space="preserve"> inactief wordt gemaakt</w:t>
             </w:r>
           </w:p>
         </w:tc>
@@ -6039,7 +6613,13 @@
               <w:cnfStyle w:val="000000000000" w:firstRow="0" w:lastRow="0" w:firstColumn="0" w:lastColumn="0" w:oddVBand="0" w:evenVBand="0" w:oddHBand="0" w:evenHBand="0" w:firstRowFirstColumn="0" w:firstRowLastColumn="0" w:lastRowFirstColumn="0" w:lastRowLastColumn="0"/>
             </w:pPr>
             <w:r>
-              <w:t>Twee identieke records met dezelfde primary key</w:t>
+              <w:t xml:space="preserve">Twee identieke </w:t>
+            </w:r>
+            <w:r>
+              <w:t>rijen</w:t>
+            </w:r>
+            <w:r>
+              <w:t xml:space="preserve"> met dezelfde primary key</w:t>
             </w:r>
           </w:p>
         </w:tc>
@@ -6086,7 +6666,13 @@
               <w:cnfStyle w:val="000000000000" w:firstRow="0" w:lastRow="0" w:firstColumn="0" w:lastColumn="0" w:oddVBand="0" w:evenVBand="0" w:oddHBand="0" w:evenHBand="0" w:firstRowFirstColumn="0" w:firstRowLastColumn="0" w:lastRowFirstColumn="0" w:lastRowLastColumn="0"/>
             </w:pPr>
             <w:r>
-              <w:t>Twee records met dezelfde primary key maar andere inhoud</w:t>
+              <w:t xml:space="preserve">Twee </w:t>
+            </w:r>
+            <w:r>
+              <w:t>rijen</w:t>
+            </w:r>
+            <w:r>
+              <w:t xml:space="preserve"> met dezelfde primary key maar andere inhoud</w:t>
             </w:r>
           </w:p>
         </w:tc>
@@ -6131,29 +6717,9 @@
             <w:pPr>
               <w:jc w:val="left"/>
               <w:cnfStyle w:val="000000000000" w:firstRow="0" w:lastRow="0" w:firstColumn="0" w:lastColumn="0" w:oddVBand="0" w:evenVBand="0" w:oddHBand="0" w:evenHBand="0" w:firstRowFirstColumn="0" w:firstRowLastColumn="0" w:lastRowFirstColumn="0" w:lastRowLastColumn="0"/>
-              <w:rPr>
-                <w:lang w:val="en-US"/>
-              </w:rPr>
-            </w:pPr>
-            <w:r>
-              <w:rPr>
-                <w:lang w:val="en-US"/>
-              </w:rPr>
-              <w:t xml:space="preserve">NULL of </w:t>
-            </w:r>
-            <w:proofErr w:type="spellStart"/>
-            <w:r>
-              <w:rPr>
-                <w:lang w:val="en-US"/>
-              </w:rPr>
-              <w:t>lege</w:t>
-            </w:r>
-            <w:proofErr w:type="spellEnd"/>
-            <w:r>
-              <w:rPr>
-                <w:lang w:val="en-US"/>
-              </w:rPr>
-              <w:t xml:space="preserve"> primary key</w:t>
+            </w:pPr>
+            <w:r>
+              <w:t>NULL of lege primary key</w:t>
             </w:r>
           </w:p>
         </w:tc>
@@ -6166,46 +6732,10 @@
             <w:pPr>
               <w:jc w:val="left"/>
               <w:cnfStyle w:val="000000000000" w:firstRow="0" w:lastRow="0" w:firstColumn="0" w:lastColumn="0" w:oddVBand="0" w:evenVBand="0" w:oddHBand="0" w:evenHBand="0" w:firstRowFirstColumn="0" w:firstRowLastColumn="0" w:lastRowFirstColumn="0" w:lastRowLastColumn="0"/>
-              <w:rPr>
-                <w:lang w:val="en-US"/>
-              </w:rPr>
-            </w:pPr>
-            <w:proofErr w:type="spellStart"/>
-            <w:r>
-              <w:rPr>
-                <w:lang w:val="en-US"/>
-              </w:rPr>
-              <w:t>Controleren</w:t>
-            </w:r>
-            <w:proofErr w:type="spellEnd"/>
-            <w:r>
-              <w:rPr>
-                <w:lang w:val="en-US"/>
-              </w:rPr>
-              <w:t xml:space="preserve"> of primary key error </w:t>
-            </w:r>
-            <w:proofErr w:type="spellStart"/>
-            <w:r>
-              <w:rPr>
-                <w:lang w:val="en-US"/>
-              </w:rPr>
-              <w:t>wordt</w:t>
-            </w:r>
-            <w:proofErr w:type="spellEnd"/>
-            <w:r>
-              <w:rPr>
-                <w:lang w:val="en-US"/>
-              </w:rPr>
-              <w:t xml:space="preserve"> </w:t>
-            </w:r>
-            <w:proofErr w:type="spellStart"/>
-            <w:r>
-              <w:rPr>
-                <w:lang w:val="en-US"/>
-              </w:rPr>
-              <w:t>gelogd</w:t>
-            </w:r>
-            <w:proofErr w:type="spellEnd"/>
+            </w:pPr>
+            <w:r>
+              <w:t>Controleren of primary key error wordt gelogd</w:t>
+            </w:r>
           </w:p>
         </w:tc>
       </w:tr>
@@ -6236,7 +6766,13 @@
               <w:cnfStyle w:val="000000000000" w:firstRow="0" w:lastRow="0" w:firstColumn="0" w:lastColumn="0" w:oddVBand="0" w:evenVBand="0" w:oddHBand="0" w:evenHBand="0" w:firstRowFirstColumn="0" w:firstRowLastColumn="0" w:lastRowFirstColumn="0" w:lastRowLastColumn="0"/>
             </w:pPr>
             <w:r>
-              <w:t>Gewijzigd record bij OVERWRITE strategie</w:t>
+              <w:t xml:space="preserve">Gewijzigd </w:t>
+            </w:r>
+            <w:r>
+              <w:t>rij</w:t>
+            </w:r>
+            <w:r>
+              <w:t xml:space="preserve"> bij OVERWRITE strategie</w:t>
             </w:r>
           </w:p>
         </w:tc>
@@ -6283,7 +6819,10 @@
               <w:cnfStyle w:val="000000000000" w:firstRow="0" w:lastRow="0" w:firstColumn="0" w:lastColumn="0" w:oddVBand="0" w:evenVBand="0" w:oddHBand="0" w:evenHBand="0" w:firstRowFirstColumn="0" w:firstRowLastColumn="0" w:lastRowFirstColumn="0" w:lastRowLastColumn="0"/>
             </w:pPr>
             <w:r>
-              <w:t>Record verdwijnt uit staging bij HARD strategie</w:t>
+              <w:t>Rij</w:t>
+            </w:r>
+            <w:r>
+              <w:t xml:space="preserve"> verdwijnt uit staging bij HARD strategie</w:t>
             </w:r>
           </w:p>
         </w:tc>
@@ -6298,7 +6837,13 @@
               <w:cnfStyle w:val="000000000000" w:firstRow="0" w:lastRow="0" w:firstColumn="0" w:lastColumn="0" w:oddVBand="0" w:evenVBand="0" w:oddHBand="0" w:evenHBand="0" w:firstRowFirstColumn="0" w:firstRowLastColumn="0" w:lastRowFirstColumn="0" w:lastRowLastColumn="0"/>
             </w:pPr>
             <w:r>
-              <w:t>Controleren of record fysiek wordt verwijderd</w:t>
+              <w:t xml:space="preserve">Controleren of </w:t>
+            </w:r>
+            <w:r>
+              <w:t>rij</w:t>
+            </w:r>
+            <w:r>
+              <w:t xml:space="preserve"> fysiek wordt verwijderd</w:t>
             </w:r>
           </w:p>
         </w:tc>
@@ -6307,13 +6852,25 @@
     <w:p/>
     <w:p>
       <w:r>
-        <w:t>De keuze voor deze testdata sluit aan op de testaanpak uit het vorige hoofdstuk. De kleine handmatige datasets maken het mogelijk om exact te controleren of het verwachte resultaat overeenkomt met het daadwerkelijke resultaat. De grote automatisch gegenereerde datasets zijn nodig om de verwerkingssnelheid en schaalbaarheid van de oplossing te meten.</w:t>
-      </w:r>
-      <w:r>
-        <w:t xml:space="preserve"> </w:t>
-      </w:r>
-      <w:r>
-        <w:t>Hiermee sluit de testdata aan op twee doelen:</w:t>
+        <w:t xml:space="preserve">De keuze voor deze testdata sluit aan op de testaanpak uit het vorige hoofdstuk. De </w:t>
+      </w:r>
+      <w:r>
+        <w:t>kleine</w:t>
+      </w:r>
+      <w:r>
+        <w:t xml:space="preserve"> datasets maken het mogelijk te controleren of het verwachte resultaat overeenkomt met het daadwerkelijke resultaat. De grote</w:t>
+      </w:r>
+      <w:r>
+        <w:t xml:space="preserve"> met python</w:t>
+      </w:r>
+      <w:r>
+        <w:t xml:space="preserve"> gegenereerde datasets zijn nodig om de </w:t>
+      </w:r>
+      <w:r>
+        <w:t>snelheid</w:t>
+      </w:r>
+      <w:r>
+        <w:t xml:space="preserve"> en schaalbaarheid van de oplossing te meten. Hiermee sluit de testdata aan op twee doelen:</w:t>
       </w:r>
     </w:p>
     <w:p>
@@ -6352,7 +6909,6 @@
         <w:rPr>
           <w:lang w:val="nl-NL"/>
         </w:rPr>
-        <w:lastRenderedPageBreak/>
         <w:t>Gegenereerde testdata</w:t>
       </w:r>
     </w:p>
@@ -6425,6 +6981,7 @@
               <w:jc w:val="left"/>
             </w:pPr>
             <w:r>
+              <w:lastRenderedPageBreak/>
               <w:t>100 rijen</w:t>
             </w:r>
           </w:p>
@@ -6440,10 +6997,7 @@
               <w:cnfStyle w:val="000000000000" w:firstRow="0" w:lastRow="0" w:firstColumn="0" w:lastColumn="0" w:oddVBand="0" w:evenVBand="0" w:oddHBand="0" w:evenHBand="0" w:firstRowFirstColumn="0" w:firstRowLastColumn="0" w:lastRowFirstColumn="0" w:lastRowLastColumn="0"/>
             </w:pPr>
             <w:r>
-              <w:t>Basiscontrole</w:t>
-            </w:r>
-            <w:r>
-              <w:t xml:space="preserve"> dataset</w:t>
+              <w:t>Basiscontrole dataset</w:t>
             </w:r>
           </w:p>
         </w:tc>
@@ -6475,10 +7029,7 @@
               <w:cnfStyle w:val="000000000000" w:firstRow="0" w:lastRow="0" w:firstColumn="0" w:lastColumn="0" w:oddVBand="0" w:evenVBand="0" w:oddHBand="0" w:evenHBand="0" w:firstRowFirstColumn="0" w:firstRowLastColumn="0" w:lastRowFirstColumn="0" w:lastRowLastColumn="0"/>
             </w:pPr>
             <w:r>
-              <w:t xml:space="preserve">Kleine </w:t>
-            </w:r>
-            <w:r>
-              <w:t>dataset</w:t>
+              <w:t>Kleine dataset</w:t>
             </w:r>
           </w:p>
         </w:tc>
@@ -6510,10 +7061,7 @@
               <w:cnfStyle w:val="000000000000" w:firstRow="0" w:lastRow="0" w:firstColumn="0" w:lastColumn="0" w:oddVBand="0" w:evenVBand="0" w:oddHBand="0" w:evenHBand="0" w:firstRowFirstColumn="0" w:firstRowLastColumn="0" w:lastRowFirstColumn="0" w:lastRowLastColumn="0"/>
             </w:pPr>
             <w:r>
-              <w:t xml:space="preserve">Middelgrote </w:t>
-            </w:r>
-            <w:r>
-              <w:t>dataset</w:t>
+              <w:t>Middelgrote dataset</w:t>
             </w:r>
           </w:p>
         </w:tc>
@@ -6545,10 +7093,7 @@
               <w:cnfStyle w:val="000000000000" w:firstRow="0" w:lastRow="0" w:firstColumn="0" w:lastColumn="0" w:oddVBand="0" w:evenVBand="0" w:oddHBand="0" w:evenHBand="0" w:firstRowFirstColumn="0" w:firstRowLastColumn="0" w:lastRowFirstColumn="0" w:lastRowLastColumn="0"/>
             </w:pPr>
             <w:r>
-              <w:t xml:space="preserve">Grote </w:t>
-            </w:r>
-            <w:r>
-              <w:t>dataset</w:t>
+              <w:t>Grote dataset</w:t>
             </w:r>
           </w:p>
         </w:tc>
@@ -6580,10 +7125,7 @@
               <w:cnfStyle w:val="000000000000" w:firstRow="0" w:lastRow="0" w:firstColumn="0" w:lastColumn="0" w:oddVBand="0" w:evenVBand="0" w:oddHBand="0" w:evenHBand="0" w:firstRowFirstColumn="0" w:firstRowLastColumn="0" w:lastRowFirstColumn="0" w:lastRowLastColumn="0"/>
             </w:pPr>
             <w:r>
-              <w:t xml:space="preserve">Maximale </w:t>
-            </w:r>
-            <w:r>
-              <w:t>dataset</w:t>
+              <w:t>Maximale dataset</w:t>
             </w:r>
           </w:p>
         </w:tc>
@@ -6608,7 +7150,7 @@
     </w:p>
     <w:p>
       <w:r>
-        <w:t>Op basis van de scenario’s en testdata zijn testcases opgesteld. Een testcase beschrijft wat er getest wordt, welke input wordt gebruikt en wat het verwachte resultaat is. Hiermee wordt het mogelijk om objectief vast te stellen of het CDC component correct werkt.</w:t>
+        <w:t>Op basis van de scenario’s en testdata zijn testcases opgesteld. Een testcase beschrijft wat er getest wordt, welke input wordt gebruikt en wat het verwachte resultaat is. Hiermee wordt het mogelijk om vast te stellen of het CDC component correct werkt.</w:t>
       </w:r>
     </w:p>
     <w:p>
@@ -6654,7 +7196,13 @@
     </w:p>
     <w:p>
       <w:r>
-        <w:t>De testcases zijn direct gebaseerd op het uitgevoerde testscript en corresponderen met de testnummers (T01 t/m T20).</w:t>
+        <w:t xml:space="preserve">De testcases zijn gebaseerd op het uitgevoerde testscript en </w:t>
+      </w:r>
+      <w:r>
+        <w:t>zijn verspreid over de tests</w:t>
+      </w:r>
+      <w:r>
+        <w:t xml:space="preserve"> met de testnummers (T01 t/m T20).</w:t>
       </w:r>
     </w:p>
     <w:p>
@@ -6679,9 +7227,9 @@
       </w:tblPr>
       <w:tblGrid>
         <w:gridCol w:w="1012"/>
-        <w:gridCol w:w="1957"/>
-        <w:gridCol w:w="2986"/>
-        <w:gridCol w:w="4242"/>
+        <w:gridCol w:w="1982"/>
+        <w:gridCol w:w="2831"/>
+        <w:gridCol w:w="4372"/>
       </w:tblGrid>
       <w:tr>
         <w:trPr>
@@ -6814,7 +7362,13 @@
               <w:cnfStyle w:val="000000000000" w:firstRow="0" w:lastRow="0" w:firstColumn="0" w:lastColumn="0" w:oddVBand="0" w:evenVBand="0" w:oddHBand="0" w:evenHBand="0" w:firstRowFirstColumn="0" w:firstRowLastColumn="0" w:lastRowFirstColumn="0" w:lastRowLastColumn="0"/>
             </w:pPr>
             <w:r>
-              <w:t>Nieuwe records worden toegevoegd</w:t>
+              <w:t xml:space="preserve">Nieuwe </w:t>
+            </w:r>
+            <w:r>
+              <w:t>rijen</w:t>
+            </w:r>
+            <w:r>
+              <w:t xml:space="preserve"> worden toegevoegd</w:t>
             </w:r>
           </w:p>
         </w:tc>
@@ -6827,43 +7381,15 @@
             <w:pPr>
               <w:jc w:val="left"/>
               <w:cnfStyle w:val="000000000000" w:firstRow="0" w:lastRow="0" w:firstColumn="0" w:lastColumn="0" w:oddVBand="0" w:evenVBand="0" w:oddHBand="0" w:evenHBand="0" w:firstRowFirstColumn="0" w:firstRowLastColumn="0" w:lastRowFirstColumn="0" w:lastRowLastColumn="0"/>
-              <w:rPr>
-                <w:lang w:val="en-US"/>
-              </w:rPr>
-            </w:pPr>
-            <w:r>
-              <w:rPr>
-                <w:lang w:val="en-US"/>
-              </w:rPr>
-              <w:t xml:space="preserve">3 </w:t>
-            </w:r>
-            <w:proofErr w:type="spellStart"/>
-            <w:r>
-              <w:rPr>
-                <w:lang w:val="en-US"/>
-              </w:rPr>
-              <w:t>actieve</w:t>
-            </w:r>
-            <w:proofErr w:type="spellEnd"/>
-            <w:r>
-              <w:rPr>
-                <w:lang w:val="en-US"/>
-              </w:rPr>
-              <w:t xml:space="preserve"> records in target, </w:t>
-            </w:r>
-            <w:proofErr w:type="spellStart"/>
-            <w:r>
-              <w:rPr>
-                <w:lang w:val="en-US"/>
-              </w:rPr>
-              <w:t>correcte</w:t>
-            </w:r>
-            <w:proofErr w:type="spellEnd"/>
-            <w:r>
-              <w:rPr>
-                <w:lang w:val="en-US"/>
-              </w:rPr>
-              <w:t xml:space="preserve"> logging</w:t>
+            </w:pPr>
+            <w:r>
+              <w:t xml:space="preserve">3 actieve </w:t>
+            </w:r>
+            <w:r>
+              <w:t>rijen</w:t>
+            </w:r>
+            <w:r>
+              <w:t xml:space="preserve"> in target, correcte logging</w:t>
             </w:r>
           </w:p>
         </w:tc>
@@ -6910,7 +7436,10 @@
               <w:cnfStyle w:val="000000000000" w:firstRow="0" w:lastRow="0" w:firstColumn="0" w:lastColumn="0" w:oddVBand="0" w:evenVBand="0" w:oddHBand="0" w:evenHBand="0" w:firstRowFirstColumn="0" w:firstRowLastColumn="0" w:lastRowFirstColumn="0" w:lastRowLastColumn="0"/>
             </w:pPr>
             <w:r>
-              <w:t>Record wordt aangepast</w:t>
+              <w:t>Rij</w:t>
+            </w:r>
+            <w:r>
+              <w:t xml:space="preserve"> wordt aangepast</w:t>
             </w:r>
           </w:p>
         </w:tc>
@@ -6942,7 +7471,6 @@
               <w:jc w:val="left"/>
             </w:pPr>
             <w:r>
-              <w:lastRenderedPageBreak/>
               <w:t>T07–T08</w:t>
             </w:r>
           </w:p>
@@ -6973,7 +7501,10 @@
               <w:cnfStyle w:val="000000000000" w:firstRow="0" w:lastRow="0" w:firstColumn="0" w:lastColumn="0" w:oddVBand="0" w:evenVBand="0" w:oddHBand="0" w:evenHBand="0" w:firstRowFirstColumn="0" w:firstRowLastColumn="0" w:lastRowFirstColumn="0" w:lastRowLastColumn="0"/>
             </w:pPr>
             <w:r>
-              <w:t>Record verdwijnt uit staging</w:t>
+              <w:t>Rij</w:t>
+            </w:r>
+            <w:r>
+              <w:t xml:space="preserve"> verdwijnt uit staging</w:t>
             </w:r>
           </w:p>
         </w:tc>
@@ -6988,7 +7519,10 @@
               <w:cnfStyle w:val="000000000000" w:firstRow="0" w:lastRow="0" w:firstColumn="0" w:lastColumn="0" w:oddVBand="0" w:evenVBand="0" w:oddHBand="0" w:evenHBand="0" w:firstRowFirstColumn="0" w:firstRowLastColumn="0" w:lastRowFirstColumn="0" w:lastRowLastColumn="0"/>
             </w:pPr>
             <w:r>
-              <w:t>Record inactief met einddatum en CDC operatie D</w:t>
+              <w:t>Rij</w:t>
+            </w:r>
+            <w:r>
+              <w:t xml:space="preserve"> inactief met einddatum en CDC operatie D</w:t>
             </w:r>
           </w:p>
         </w:tc>
@@ -7005,6 +7539,7 @@
               <w:jc w:val="left"/>
             </w:pPr>
             <w:r>
+              <w:lastRenderedPageBreak/>
               <w:t>T09–T12</w:t>
             </w:r>
           </w:p>
@@ -7050,7 +7585,13 @@
               <w:cnfStyle w:val="000000000000" w:firstRow="0" w:lastRow="0" w:firstColumn="0" w:lastColumn="0" w:oddVBand="0" w:evenVBand="0" w:oddHBand="0" w:evenHBand="0" w:firstRowFirstColumn="0" w:firstRowLastColumn="0" w:lastRowFirstColumn="0" w:lastRowLastColumn="0"/>
             </w:pPr>
             <w:r>
-              <w:t>Fouten worden gelogd, alleen geldige records verwerkt</w:t>
+              <w:t xml:space="preserve">Fouten worden gelogd, alleen geldige </w:t>
+            </w:r>
+            <w:r>
+              <w:t>rijen</w:t>
+            </w:r>
+            <w:r>
+              <w:t xml:space="preserve"> verwerkt</w:t>
             </w:r>
           </w:p>
         </w:tc>
@@ -7110,29 +7651,9 @@
             <w:pPr>
               <w:jc w:val="left"/>
               <w:cnfStyle w:val="000000000000" w:firstRow="0" w:lastRow="0" w:firstColumn="0" w:lastColumn="0" w:oddVBand="0" w:evenVBand="0" w:oddHBand="0" w:evenHBand="0" w:firstRowFirstColumn="0" w:firstRowLastColumn="0" w:lastRowFirstColumn="0" w:lastRowLastColumn="0"/>
-              <w:rPr>
-                <w:lang w:val="en-US"/>
-              </w:rPr>
-            </w:pPr>
-            <w:r>
-              <w:rPr>
-                <w:lang w:val="en-US"/>
-              </w:rPr>
-              <w:t xml:space="preserve">Run status = FAILED, </w:t>
-            </w:r>
-            <w:proofErr w:type="spellStart"/>
-            <w:r>
-              <w:rPr>
-                <w:lang w:val="en-US"/>
-              </w:rPr>
-              <w:t>geen</w:t>
-            </w:r>
-            <w:proofErr w:type="spellEnd"/>
-            <w:r>
-              <w:rPr>
-                <w:lang w:val="en-US"/>
-              </w:rPr>
-              <w:t xml:space="preserve"> entity logging</w:t>
+            </w:pPr>
+            <w:r>
+              <w:t>Run status = FAILED, geen entity logging</w:t>
             </w:r>
           </w:p>
         </w:tc>
@@ -7179,7 +7700,10 @@
               <w:cnfStyle w:val="000000000000" w:firstRow="0" w:lastRow="0" w:firstColumn="0" w:lastColumn="0" w:oddVBand="0" w:evenVBand="0" w:oddHBand="0" w:evenHBand="0" w:firstRowFirstColumn="0" w:firstRowLastColumn="0" w:lastRowFirstColumn="0" w:lastRowLastColumn="0"/>
             </w:pPr>
             <w:r>
-              <w:t>Record wordt overschreven</w:t>
+              <w:t>Rij</w:t>
+            </w:r>
+            <w:r>
+              <w:t xml:space="preserve"> wordt overschreven</w:t>
             </w:r>
           </w:p>
         </w:tc>
@@ -7194,7 +7718,13 @@
               <w:cnfStyle w:val="000000000000" w:firstRow="0" w:lastRow="0" w:firstColumn="0" w:lastColumn="0" w:oddVBand="0" w:evenVBand="0" w:oddHBand="0" w:evenHBand="0" w:firstRowFirstColumn="0" w:firstRowLastColumn="0" w:lastRowFirstColumn="0" w:lastRowLastColumn="0"/>
             </w:pPr>
             <w:r>
-              <w:t>Slechts 1 record aanwezig met nieuwe waarde</w:t>
+              <w:t xml:space="preserve">Slechts 1 </w:t>
+            </w:r>
+            <w:r>
+              <w:t>rij</w:t>
+            </w:r>
+            <w:r>
+              <w:t xml:space="preserve"> aanwezig met nieuwe waarde</w:t>
             </w:r>
           </w:p>
         </w:tc>
@@ -7241,7 +7771,10 @@
               <w:cnfStyle w:val="000000000000" w:firstRow="0" w:lastRow="0" w:firstColumn="0" w:lastColumn="0" w:oddVBand="0" w:evenVBand="0" w:oddHBand="0" w:evenHBand="0" w:firstRowFirstColumn="0" w:firstRowLastColumn="0" w:lastRowFirstColumn="0" w:lastRowLastColumn="0"/>
             </w:pPr>
             <w:r>
-              <w:t>Record verdwijnt bij HARD strategie</w:t>
+              <w:t>Rij</w:t>
+            </w:r>
+            <w:r>
+              <w:t xml:space="preserve"> verdwijnt bij HARD strategie</w:t>
             </w:r>
           </w:p>
         </w:tc>
@@ -7256,7 +7789,10 @@
               <w:cnfStyle w:val="000000000000" w:firstRow="0" w:lastRow="0" w:firstColumn="0" w:lastColumn="0" w:oddVBand="0" w:evenVBand="0" w:oddHBand="0" w:evenHBand="0" w:firstRowFirstColumn="0" w:firstRowLastColumn="0" w:lastRowFirstColumn="0" w:lastRowLastColumn="0"/>
             </w:pPr>
             <w:r>
-              <w:t>Record fysiek verwijderd uit target</w:t>
+              <w:t>Rij</w:t>
+            </w:r>
+            <w:r>
+              <w:t xml:space="preserve"> fysiek verwijderd uit target</w:t>
             </w:r>
           </w:p>
         </w:tc>
@@ -7291,9 +7827,9 @@
       </w:tblPr>
       <w:tblGrid>
         <w:gridCol w:w="626"/>
-        <w:gridCol w:w="2748"/>
+        <w:gridCol w:w="2339"/>
         <w:gridCol w:w="1970"/>
-        <w:gridCol w:w="4076"/>
+        <w:gridCol w:w="3498"/>
       </w:tblGrid>
       <w:tr>
         <w:trPr>
@@ -7411,7 +7947,13 @@
               <w:cnfStyle w:val="000000000000" w:firstRow="0" w:lastRow="0" w:firstColumn="0" w:lastColumn="0" w:oddVBand="0" w:evenVBand="0" w:oddHBand="0" w:evenHBand="0" w:firstRowFirstColumn="0" w:firstRowLastColumn="0" w:lastRowFirstColumn="0" w:lastRowLastColumn="0"/>
             </w:pPr>
             <w:r>
-              <w:t>Record E001 met salary 5000</w:t>
+              <w:t>R</w:t>
+            </w:r>
+            <w:r>
+              <w:t>ij</w:t>
+            </w:r>
+            <w:r>
+              <w:t xml:space="preserve"> E001 met salary 5000</w:t>
             </w:r>
           </w:p>
         </w:tc>
@@ -7441,7 +7983,10 @@
               <w:cnfStyle w:val="000000000000" w:firstRow="0" w:lastRow="0" w:firstColumn="0" w:lastColumn="0" w:oddVBand="0" w:evenVBand="0" w:oddHBand="0" w:evenHBand="0" w:firstRowFirstColumn="0" w:firstRowLastColumn="0" w:lastRowFirstColumn="0" w:lastRowLastColumn="0"/>
             </w:pPr>
             <w:r>
-              <w:t>Record wordt toegevoegd (insert)</w:t>
+              <w:t>Rij</w:t>
+            </w:r>
+            <w:r>
+              <w:t xml:space="preserve"> wordt toegevoegd (insert)</w:t>
             </w:r>
           </w:p>
         </w:tc>
@@ -7473,7 +8018,10 @@
               <w:cnfStyle w:val="000000000000" w:firstRow="0" w:lastRow="0" w:firstColumn="0" w:lastColumn="0" w:oddVBand="0" w:evenVBand="0" w:oddHBand="0" w:evenHBand="0" w:firstRowFirstColumn="0" w:firstRowLastColumn="0" w:lastRowFirstColumn="0" w:lastRowLastColumn="0"/>
             </w:pPr>
             <w:r>
-              <w:t>Record E001 met salary 6000</w:t>
+              <w:t>Rij</w:t>
+            </w:r>
+            <w:r>
+              <w:t xml:space="preserve"> E001 met salary 6000</w:t>
             </w:r>
           </w:p>
         </w:tc>
@@ -7503,7 +8051,19 @@
               <w:cnfStyle w:val="000000000000" w:firstRow="0" w:lastRow="0" w:firstColumn="0" w:lastColumn="0" w:oddVBand="0" w:evenVBand="0" w:oddHBand="0" w:evenHBand="0" w:firstRowFirstColumn="0" w:firstRowLastColumn="0" w:lastRowFirstColumn="0" w:lastRowLastColumn="0"/>
             </w:pPr>
             <w:r>
-              <w:t>Oude record historisch, nieuwe record actief</w:t>
+              <w:t xml:space="preserve">Oude </w:t>
+            </w:r>
+            <w:r>
+              <w:t>rij</w:t>
+            </w:r>
+            <w:r>
+              <w:t xml:space="preserve"> historisch, nieuwe </w:t>
+            </w:r>
+            <w:r>
+              <w:t>rij</w:t>
+            </w:r>
+            <w:r>
+              <w:t xml:space="preserve"> actief</w:t>
             </w:r>
           </w:p>
         </w:tc>
@@ -7535,7 +8095,13 @@
               <w:cnfStyle w:val="000000000000" w:firstRow="0" w:lastRow="0" w:firstColumn="0" w:lastColumn="0" w:oddVBand="0" w:evenVBand="0" w:oddHBand="0" w:evenHBand="0" w:firstRowFirstColumn="0" w:firstRowLastColumn="0" w:lastRowFirstColumn="0" w:lastRowLastColumn="0"/>
             </w:pPr>
             <w:r>
-              <w:t>Record E001 ontbreekt</w:t>
+              <w:t>R</w:t>
+            </w:r>
+            <w:r>
+              <w:t>ij</w:t>
+            </w:r>
+            <w:r>
+              <w:t xml:space="preserve"> E001 ontbreekt</w:t>
             </w:r>
           </w:p>
         </w:tc>
@@ -7565,7 +8131,10 @@
               <w:cnfStyle w:val="000000000000" w:firstRow="0" w:lastRow="0" w:firstColumn="0" w:lastColumn="0" w:oddVBand="0" w:evenVBand="0" w:oddHBand="0" w:evenHBand="0" w:firstRowFirstColumn="0" w:firstRowLastColumn="0" w:lastRowFirstColumn="0" w:lastRowLastColumn="0"/>
             </w:pPr>
             <w:r>
-              <w:t>Record wordt gedeactiveerd of verwijderd</w:t>
+              <w:t>Rij</w:t>
+            </w:r>
+            <w:r>
+              <w:t xml:space="preserve"> wordt gedeactiveerd of verwijderd</w:t>
             </w:r>
           </w:p>
         </w:tc>
@@ -7699,7 +8268,6 @@
               <w:jc w:val="left"/>
             </w:pPr>
             <w:r>
-              <w:lastRenderedPageBreak/>
               <w:t>Detectie inserts</w:t>
             </w:r>
           </w:p>
@@ -7715,7 +8283,13 @@
               <w:cnfStyle w:val="000000000000" w:firstRow="0" w:lastRow="0" w:firstColumn="0" w:lastColumn="0" w:oddVBand="0" w:evenVBand="0" w:oddHBand="0" w:evenHBand="0" w:firstRowFirstColumn="0" w:firstRowLastColumn="0" w:lastRowFirstColumn="0" w:lastRowLastColumn="0"/>
             </w:pPr>
             <w:r>
-              <w:t>Nieuwe records worden correct toegevoegd aan target</w:t>
+              <w:t xml:space="preserve">Nieuwe </w:t>
+            </w:r>
+            <w:r>
+              <w:t>rijen</w:t>
+            </w:r>
+            <w:r>
+              <w:t xml:space="preserve"> worden correct toegevoegd aan target</w:t>
             </w:r>
           </w:p>
         </w:tc>
@@ -7732,6 +8306,7 @@
               <w:jc w:val="left"/>
             </w:pPr>
             <w:r>
+              <w:lastRenderedPageBreak/>
               <w:t>Detectie updates</w:t>
             </w:r>
           </w:p>
@@ -7779,7 +8354,10 @@
               <w:cnfStyle w:val="000000000000" w:firstRow="0" w:lastRow="0" w:firstColumn="0" w:lastColumn="0" w:oddVBand="0" w:evenVBand="0" w:oddHBand="0" w:evenHBand="0" w:firstRowFirstColumn="0" w:firstRowLastColumn="0" w:lastRowFirstColumn="0" w:lastRowLastColumn="0"/>
             </w:pPr>
             <w:r>
-              <w:t>Records worden correct verwerkt volgens SOFT of HARD delete</w:t>
+              <w:t>Rijen</w:t>
+            </w:r>
+            <w:r>
+              <w:t xml:space="preserve"> worden correct verwerkt volgens SOFT of HARD delete</w:t>
             </w:r>
           </w:p>
         </w:tc>
@@ -7929,13 +8507,7 @@
     </w:p>
     <w:p>
       <w:r>
-        <w:t>Deze criteria zijn gebaseerd op de niet</w:t>
-      </w:r>
-      <w:r>
-        <w:t xml:space="preserve"> </w:t>
-      </w:r>
-      <w:r>
-        <w:t xml:space="preserve">functionele eisen zoals performance en betrouwbaarheid. </w:t>
+        <w:t xml:space="preserve">Deze criteria zijn gebaseerd op de niet functionele eisen zoals performance en betrouwbaarheid. </w:t>
       </w:r>
     </w:p>
     <w:tbl>
@@ -7946,7 +8518,7 @@
       </w:tblPr>
       <w:tblGrid>
         <w:gridCol w:w="1692"/>
-        <w:gridCol w:w="6500"/>
+        <w:gridCol w:w="6227"/>
       </w:tblGrid>
       <w:tr>
         <w:trPr>
@@ -8022,7 +8594,13 @@
               <w:cnfStyle w:val="000000000000" w:firstRow="0" w:lastRow="0" w:firstColumn="0" w:lastColumn="0" w:oddVBand="0" w:evenVBand="0" w:oddHBand="0" w:evenHBand="0" w:firstRowFirstColumn="0" w:firstRowLastColumn="0" w:lastRowFirstColumn="0" w:lastRowLastColumn="0"/>
             </w:pPr>
             <w:r>
-              <w:t>1 miljoen records wordt binnen acceptabele tijd verwerkt (≤ 15 minuten)</w:t>
+              <w:t xml:space="preserve">1 miljoen </w:t>
+            </w:r>
+            <w:r>
+              <w:t>rijen</w:t>
+            </w:r>
+            <w:r>
+              <w:t xml:space="preserve"> wordt binnen acceptabele tijd verwerkt (≤ 15 minuten)</w:t>
             </w:r>
           </w:p>
         </w:tc>
@@ -8187,12 +8765,24 @@
     </w:p>
     <w:p>
       <w:r>
-        <w:t>In dit hoofdstuk wordt beschreven hoe de testen daadwerkelijk zijn uitgevoerd. De uitvoering is gebaseerd op het testontwerp en de opgestelde testcases uit het vorige hoofdstuk.</w:t>
-      </w:r>
-    </w:p>
-    <w:p>
-      <w:r>
-        <w:t>De testen zijn uitgevoerd in een Snowflake omgeving met behulp van SQL procedures en Python scripts. Per scenario is de testdata ingeladen in de staging tabellen, waarna het CDC proces is gestart. De resultaten zijn vervolgens gecontroleerd in de target en logging tabellen.</w:t>
+        <w:t>In dit hoofdstuk wordt beschreven hoe de tes</w:t>
+      </w:r>
+      <w:r>
+        <w:t>ts</w:t>
+      </w:r>
+      <w:r>
+        <w:t xml:space="preserve"> zijn uitgevoerd. De uitvoering is gebaseerd op het testontwerp en de opgestelde testcases uit het vorige hoofdstuk.</w:t>
+      </w:r>
+    </w:p>
+    <w:p>
+      <w:r>
+        <w:t>De test</w:t>
+      </w:r>
+      <w:r>
+        <w:t>s</w:t>
+      </w:r>
+      <w:r>
+        <w:t xml:space="preserve"> zijn uitgevoerd in een Snowflake omgeving met behulp van SQL procedures en Python scripts. Per scenario is de testdata ingeladen in de staging tabellen, waarna het CDC proces is gestart. De resultaten zijn vervolgens gecontroleerd in de target en logging tabellen.</w:t>
       </w:r>
     </w:p>
     <w:p>
@@ -8413,7 +9003,13 @@
               <w:cnfStyle w:val="000000000000" w:firstRow="0" w:lastRow="0" w:firstColumn="0" w:lastColumn="0" w:oddVBand="0" w:evenVBand="0" w:oddHBand="0" w:evenHBand="0" w:firstRowFirstColumn="0" w:firstRowLastColumn="0" w:lastRowFirstColumn="0" w:lastRowLastColumn="0"/>
             </w:pPr>
             <w:r>
-              <w:t>Nieuwe records toevoegen</w:t>
+              <w:t xml:space="preserve">Nieuwe </w:t>
+            </w:r>
+            <w:r>
+              <w:t>rijen</w:t>
+            </w:r>
+            <w:r>
+              <w:t xml:space="preserve"> toevoegen</w:t>
             </w:r>
           </w:p>
         </w:tc>
@@ -8426,29 +9022,15 @@
             <w:pPr>
               <w:jc w:val="left"/>
               <w:cnfStyle w:val="000000000000" w:firstRow="0" w:lastRow="0" w:firstColumn="0" w:lastColumn="0" w:oddVBand="0" w:evenVBand="0" w:oddHBand="0" w:evenHBand="0" w:firstRowFirstColumn="0" w:firstRowLastColumn="0" w:lastRowFirstColumn="0" w:lastRowLastColumn="0"/>
-              <w:rPr>
-                <w:lang w:val="en-US"/>
-              </w:rPr>
-            </w:pPr>
-            <w:r>
-              <w:rPr>
-                <w:lang w:val="en-US"/>
-              </w:rPr>
-              <w:t xml:space="preserve">Aantal </w:t>
-            </w:r>
-            <w:proofErr w:type="spellStart"/>
-            <w:r>
-              <w:rPr>
-                <w:lang w:val="en-US"/>
-              </w:rPr>
-              <w:t>actieve</w:t>
-            </w:r>
-            <w:proofErr w:type="spellEnd"/>
-            <w:r>
-              <w:rPr>
-                <w:lang w:val="en-US"/>
-              </w:rPr>
-              <w:t xml:space="preserve"> records in target</w:t>
+            </w:pPr>
+            <w:r>
+              <w:t xml:space="preserve">Aantal actieve </w:t>
+            </w:r>
+            <w:r>
+              <w:t>rijen</w:t>
+            </w:r>
+            <w:r>
+              <w:t xml:space="preserve"> in target</w:t>
             </w:r>
           </w:p>
         </w:tc>
@@ -8542,7 +9124,10 @@
               <w:cnfStyle w:val="000000000000" w:firstRow="0" w:lastRow="0" w:firstColumn="0" w:lastColumn="0" w:oddVBand="0" w:evenVBand="0" w:oddHBand="0" w:evenHBand="0" w:firstRowFirstColumn="0" w:firstRowLastColumn="0" w:lastRowFirstColumn="0" w:lastRowLastColumn="0"/>
             </w:pPr>
             <w:r>
-              <w:t>Record inactief + einddatum</w:t>
+              <w:t>Rij</w:t>
+            </w:r>
+            <w:r>
+              <w:t xml:space="preserve"> inactief + einddatum</w:t>
             </w:r>
           </w:p>
         </w:tc>
@@ -8683,7 +9268,10 @@
               <w:cnfStyle w:val="000000000000" w:firstRow="0" w:lastRow="0" w:firstColumn="0" w:lastColumn="0" w:oddVBand="0" w:evenVBand="0" w:oddHBand="0" w:evenHBand="0" w:firstRowFirstColumn="0" w:firstRowLastColumn="0" w:lastRowFirstColumn="0" w:lastRowLastColumn="0"/>
             </w:pPr>
             <w:r>
-              <w:t>Slechts 1 actuele record</w:t>
+              <w:t xml:space="preserve">Slechts 1 actuele </w:t>
+            </w:r>
+            <w:r>
+              <w:t>rij</w:t>
             </w:r>
           </w:p>
         </w:tc>
@@ -8731,25 +9319,15 @@
               <w:cnfStyle w:val="000000000000" w:firstRow="0" w:lastRow="0" w:firstColumn="0" w:lastColumn="0" w:oddVBand="0" w:evenVBand="0" w:oddHBand="0" w:evenHBand="0" w:firstRowFirstColumn="0" w:firstRowLastColumn="0" w:lastRowFirstColumn="0" w:lastRowLastColumn="0"/>
             </w:pPr>
             <w:r>
-              <w:t>Record niet meer aanwezig</w:t>
+              <w:t>Rij</w:t>
+            </w:r>
+            <w:r>
+              <w:t xml:space="preserve"> niet meer aanwezig</w:t>
             </w:r>
           </w:p>
         </w:tc>
       </w:tr>
     </w:tbl>
-    <w:p>
-      <w:hyperlink r:id="rId17" w:history="1">
-        <w:r>
-          <w:rPr>
-            <w:rStyle w:val="Hyperlink"/>
-          </w:rPr>
-          <w:t>https://www.tmap.net/building-blocks/data-quality/</w:t>
-        </w:r>
-      </w:hyperlink>
-      <w:r>
-        <w:t xml:space="preserve"> </w:t>
-      </w:r>
-    </w:p>
     <w:p>
       <w:pPr>
         <w:pStyle w:val="Heading20"/>
@@ -9021,10 +9599,7 @@
               <w:cnfStyle w:val="000000000000" w:firstRow="0" w:lastRow="0" w:firstColumn="0" w:lastColumn="0" w:oddVBand="0" w:evenVBand="0" w:oddHBand="0" w:evenHBand="0" w:firstRowFirstColumn="0" w:firstRowLastColumn="0" w:lastRowFirstColumn="0" w:lastRowLastColumn="0"/>
             </w:pPr>
             <w:r>
-              <w:t>Basiscontrole</w:t>
-            </w:r>
-            <w:r>
-              <w:t xml:space="preserve"> dataset</w:t>
+              <w:t>Basiscontrole dataset</w:t>
             </w:r>
           </w:p>
         </w:tc>
@@ -9056,10 +9631,7 @@
               <w:cnfStyle w:val="000000000000" w:firstRow="0" w:lastRow="0" w:firstColumn="0" w:lastColumn="0" w:oddVBand="0" w:evenVBand="0" w:oddHBand="0" w:evenHBand="0" w:firstRowFirstColumn="0" w:firstRowLastColumn="0" w:lastRowFirstColumn="0" w:lastRowLastColumn="0"/>
             </w:pPr>
             <w:r>
-              <w:t xml:space="preserve">Kleine </w:t>
-            </w:r>
-            <w:r>
-              <w:t>dataset</w:t>
+              <w:t>Kleine dataset</w:t>
             </w:r>
           </w:p>
         </w:tc>
@@ -9091,10 +9663,7 @@
               <w:cnfStyle w:val="000000000000" w:firstRow="0" w:lastRow="0" w:firstColumn="0" w:lastColumn="0" w:oddVBand="0" w:evenVBand="0" w:oddHBand="0" w:evenHBand="0" w:firstRowFirstColumn="0" w:firstRowLastColumn="0" w:lastRowFirstColumn="0" w:lastRowLastColumn="0"/>
             </w:pPr>
             <w:r>
-              <w:t xml:space="preserve">Middelgrote </w:t>
-            </w:r>
-            <w:r>
-              <w:t>dataset</w:t>
+              <w:t>Middelgrote dataset</w:t>
             </w:r>
           </w:p>
         </w:tc>
@@ -9126,10 +9695,7 @@
               <w:cnfStyle w:val="000000000000" w:firstRow="0" w:lastRow="0" w:firstColumn="0" w:lastColumn="0" w:oddVBand="0" w:evenVBand="0" w:oddHBand="0" w:evenHBand="0" w:firstRowFirstColumn="0" w:firstRowLastColumn="0" w:lastRowFirstColumn="0" w:lastRowLastColumn="0"/>
             </w:pPr>
             <w:r>
-              <w:t xml:space="preserve">Grote </w:t>
-            </w:r>
-            <w:r>
-              <w:t>dataset</w:t>
+              <w:t>Grote dataset</w:t>
             </w:r>
           </w:p>
         </w:tc>
@@ -9161,21 +9727,12 @@
               <w:cnfStyle w:val="000000000000" w:firstRow="0" w:lastRow="0" w:firstColumn="0" w:lastColumn="0" w:oddVBand="0" w:evenVBand="0" w:oddHBand="0" w:evenHBand="0" w:firstRowFirstColumn="0" w:firstRowLastColumn="0" w:lastRowFirstColumn="0" w:lastRowLastColumn="0"/>
             </w:pPr>
             <w:r>
-              <w:t xml:space="preserve">Maximale </w:t>
-            </w:r>
-            <w:r>
-              <w:t>dataset</w:t>
+              <w:t>Maximale dataset</w:t>
             </w:r>
           </w:p>
         </w:tc>
       </w:tr>
     </w:tbl>
-    <w:p>
-      <w:pPr>
-        <w:spacing w:after="200" w:line="276" w:lineRule="auto"/>
-        <w:jc w:val="left"/>
-      </w:pPr>
-    </w:p>
     <w:p>
       <w:pPr>
         <w:spacing w:after="200" w:line="276" w:lineRule="auto"/>
@@ -9188,17 +9745,6 @@
           <w:szCs w:val="60"/>
         </w:rPr>
       </w:pPr>
-      <w:hyperlink r:id="rId18" w:history="1">
-        <w:r>
-          <w:rPr>
-            <w:rStyle w:val="Hyperlink"/>
-          </w:rPr>
-          <w:t>https://www.tmap.net/building-blocks/performance-testing/</w:t>
-        </w:r>
-      </w:hyperlink>
-      <w:r>
-        <w:t xml:space="preserve"> </w:t>
-      </w:r>
       <w:r>
         <w:br w:type="page"/>
       </w:r>
@@ -9222,7 +9768,25 @@
     </w:p>
     <w:p>
       <w:r>
-        <w:t>Dit hoofdstuk geeft een overzicht van de uitkomsten van de uitgevoerde testen. De resultaten zijn gebaseerd op de testcases (T01 t/m T20) en de performance metingen voor zowel de SQL als Python implementatie.</w:t>
+        <w:t xml:space="preserve">Dit hoofdstuk geeft een overzicht van de uitkomsten van de uitgevoerde testen. De resultaten zijn gebaseerd op de testcases (T01 t/m T20) en de performance metingen </w:t>
+      </w:r>
+      <w:r>
+        <w:t xml:space="preserve">van </w:t>
+      </w:r>
+      <w:r>
+        <w:t xml:space="preserve">de SQL </w:t>
+      </w:r>
+      <w:r>
+        <w:t>en</w:t>
+      </w:r>
+      <w:r>
+        <w:t xml:space="preserve"> Python implementatie</w:t>
+      </w:r>
+      <w:r>
+        <w:t>s</w:t>
+      </w:r>
+      <w:r>
+        <w:t>.</w:t>
       </w:r>
     </w:p>
     <w:p>
@@ -9281,7 +9845,7 @@
                     </pic:cNvPicPr>
                   </pic:nvPicPr>
                   <pic:blipFill>
-                    <a:blip r:embed="rId19"/>
+                    <a:blip r:embed="rId17"/>
                     <a:stretch>
                       <a:fillRect/>
                     </a:stretch>
@@ -9361,7 +9925,13 @@
         </w:numPr>
       </w:pPr>
       <w:r>
-        <w:t xml:space="preserve">Alleen geldige records worden daadwerkelijk verwerkt in de target tabel </w:t>
+        <w:t xml:space="preserve">Alleen geldige </w:t>
+      </w:r>
+      <w:r>
+        <w:t>rijen</w:t>
+      </w:r>
+      <w:r>
+        <w:t xml:space="preserve"> worden daadwerkelijk verwerkt in de target tabel </w:t>
       </w:r>
     </w:p>
     <w:p>
@@ -9472,39 +10042,27 @@
               <w:rPr>
                 <w:bCs/>
               </w:rPr>
-              <w:t>SQL</w:t>
-            </w:r>
-            <w:r>
+              <w:t>SQL in sec</w:t>
+            </w:r>
+          </w:p>
+        </w:tc>
+        <w:tc>
+          <w:tcPr>
+            <w:tcW w:w="1532" w:type="dxa"/>
+            <w:hideMark/>
+          </w:tcPr>
+          <w:p>
+            <w:pPr>
+              <w:cnfStyle w:val="100000000000" w:firstRow="1" w:lastRow="0" w:firstColumn="0" w:lastColumn="0" w:oddVBand="0" w:evenVBand="0" w:oddHBand="0" w:evenHBand="0" w:firstRowFirstColumn="0" w:firstRowLastColumn="0" w:lastRowFirstColumn="0" w:lastRowLastColumn="0"/>
               <w:rPr>
                 <w:bCs/>
               </w:rPr>
-              <w:t xml:space="preserve"> in sec</w:t>
-            </w:r>
-          </w:p>
-        </w:tc>
-        <w:tc>
-          <w:tcPr>
-            <w:tcW w:w="1532" w:type="dxa"/>
-            <w:hideMark/>
-          </w:tcPr>
-          <w:p>
-            <w:pPr>
-              <w:cnfStyle w:val="100000000000" w:firstRow="1" w:lastRow="0" w:firstColumn="0" w:lastColumn="0" w:oddVBand="0" w:evenVBand="0" w:oddHBand="0" w:evenHBand="0" w:firstRowFirstColumn="0" w:firstRowLastColumn="0" w:lastRowFirstColumn="0" w:lastRowLastColumn="0"/>
+            </w:pPr>
+            <w:r>
               <w:rPr>
                 <w:bCs/>
               </w:rPr>
-            </w:pPr>
-            <w:r>
-              <w:rPr>
-                <w:bCs/>
-              </w:rPr>
-              <w:t xml:space="preserve">Python </w:t>
-            </w:r>
-            <w:r>
-              <w:rPr>
-                <w:bCs/>
-              </w:rPr>
-              <w:t>in sec</w:t>
+              <w:t>Python in sec</w:t>
             </w:r>
           </w:p>
         </w:tc>
@@ -9791,14 +10349,7 @@
                 <w:bCs/>
                 <w:lang w:val="nl-NL"/>
               </w:rPr>
-              <w:t xml:space="preserve">SQL </w:t>
-            </w:r>
-            <w:r>
-              <w:rPr>
-                <w:bCs/>
-                <w:lang w:val="nl-NL"/>
-              </w:rPr>
-              <w:t>in sec</w:t>
+              <w:t>SQL in sec</w:t>
             </w:r>
           </w:p>
         </w:tc>
@@ -9821,14 +10372,7 @@
                 <w:bCs/>
                 <w:lang w:val="nl-NL"/>
               </w:rPr>
-              <w:t xml:space="preserve">Python </w:t>
-            </w:r>
-            <w:r>
-              <w:rPr>
-                <w:bCs/>
-                <w:lang w:val="nl-NL"/>
-              </w:rPr>
-              <w:t>in sec</w:t>
+              <w:t>Python in sec</w:t>
             </w:r>
           </w:p>
         </w:tc>
@@ -10234,13 +10778,7 @@
               <w:rPr>
                 <w:bCs/>
               </w:rPr>
-              <w:t>SQL</w:t>
-            </w:r>
-            <w:r>
-              <w:rPr>
-                <w:bCs/>
-              </w:rPr>
-              <w:t xml:space="preserve"> in sec</w:t>
+              <w:t>SQL in sec</w:t>
             </w:r>
           </w:p>
         </w:tc>
@@ -10261,13 +10799,7 @@
               <w:rPr>
                 <w:bCs/>
               </w:rPr>
-              <w:t>Python</w:t>
-            </w:r>
-            <w:r>
-              <w:rPr>
-                <w:bCs/>
-              </w:rPr>
-              <w:t xml:space="preserve"> in sec</w:t>
+              <w:t>Python in sec</w:t>
             </w:r>
           </w:p>
         </w:tc>
@@ -10575,13 +11107,7 @@
               <w:rPr>
                 <w:bCs/>
               </w:rPr>
-              <w:t xml:space="preserve">SQL </w:t>
-            </w:r>
-            <w:r>
-              <w:rPr>
-                <w:bCs/>
-              </w:rPr>
-              <w:t>in sec</w:t>
+              <w:t>SQL in sec</w:t>
             </w:r>
           </w:p>
         </w:tc>
@@ -11713,7 +12239,13 @@
               <w:cnfStyle w:val="000000000000" w:firstRow="0" w:lastRow="0" w:firstColumn="0" w:lastColumn="0" w:oddVBand="0" w:evenVBand="0" w:oddHBand="0" w:evenHBand="0" w:firstRowFirstColumn="0" w:firstRowLastColumn="0" w:lastRowFirstColumn="0" w:lastRowLastColumn="0"/>
             </w:pPr>
             <w:r>
-              <w:t>Nieuwe records worden correct toegevoegd (T01–T03)</w:t>
+              <w:t xml:space="preserve">Nieuwe </w:t>
+            </w:r>
+            <w:r>
+              <w:t>rijen</w:t>
+            </w:r>
+            <w:r>
+              <w:t xml:space="preserve"> worden correct toegevoegd (T01–T03)</w:t>
             </w:r>
           </w:p>
         </w:tc>
@@ -12554,10 +13086,7 @@
         <w:jc w:val="left"/>
       </w:pPr>
       <w:r>
-        <w:t>De oplossing vormt daarmee een bruikbare basis die verder ontwikkeld kan worden richting een productieklare implementatie</w:t>
-      </w:r>
-      <w:r>
-        <w:t>.</w:t>
+        <w:t>De oplossing vormt daarmee een bruikbare basis die verder ontwikkeld kan worden richting een productieklare implementatie.</w:t>
       </w:r>
       <w:r>
         <w:br w:type="page"/>
@@ -12587,12 +13116,12 @@
           <w:pPr>
             <w:pStyle w:val="Head1"/>
             <w:rPr>
-              <w:lang w:val="en-US"/>
+              <w:lang w:val="nl-NL"/>
             </w:rPr>
           </w:pPr>
           <w:r>
             <w:rPr>
-              <w:lang w:val="en-US"/>
+              <w:lang w:val="nl-NL"/>
             </w:rPr>
             <w:t>Bibliography</w:t>
           </w:r>
@@ -12619,9 +13148,6 @@
                 <w:fldChar w:fldCharType="begin"/>
               </w:r>
               <w:r>
-                <w:rPr>
-                  <w:lang w:val="en-US"/>
-                </w:rPr>
                 <w:instrText xml:space="preserve"> BIBLIOGRAPHY </w:instrText>
               </w:r>
               <w:r>
@@ -12630,38 +13156,22 @@
               <w:r>
                 <w:rPr>
                   <w:noProof/>
-                  <w:lang w:val="en-US"/>
                 </w:rPr>
-                <w:t xml:space="preserve">Striim Team. </w:t>
-              </w:r>
-              <w:r>
-                <w:rPr>
-                  <w:noProof/>
-                  <w:lang w:val="en-US"/>
-                </w:rPr>
-                <w:t xml:space="preserve">(sd). </w:t>
+                <w:t xml:space="preserve">Striim Team. (sd). </w:t>
               </w:r>
               <w:r>
                 <w:rPr>
                   <w:i/>
                   <w:iCs/>
                   <w:noProof/>
-                  <w:lang w:val="en-US"/>
                 </w:rPr>
                 <w:t>Change Data Capture (CDC) in Snowflake: Challenges, Methods, and Best Practices</w:t>
               </w:r>
               <w:r>
                 <w:rPr>
                   <w:noProof/>
-                  <w:lang w:val="en-US"/>
                 </w:rPr>
-                <w:t xml:space="preserve">. </w:t>
-              </w:r>
-              <w:r>
-                <w:rPr>
-                  <w:noProof/>
-                </w:rPr>
-                <w:t>Opgehaald van Striim: https://www.striim.com/blog/cdc-to-snowflake/</w:t>
+                <w:t>. Opgehaald van Striim: https://www.striim.com/blog/cdc-to-snowflake/</w:t>
               </w:r>
             </w:p>
             <w:p>
@@ -12728,6 +13238,9 @@
       <w:pPr>
         <w:pStyle w:val="BoilerplateHead1"/>
         <w:ind w:left="567" w:right="4820"/>
+        <w:rPr>
+          <w:lang w:val="nl-NL"/>
+        </w:rPr>
       </w:pPr>
       <w:r>
         <w:rPr>
@@ -12849,7 +13362,7 @@
               </wp:anchor>
             </w:drawing>
           </mc:Choice>
-          <mc:Fallback xmlns:a="http://schemas.openxmlformats.org/drawingml/2006/main" xmlns:pic="http://schemas.openxmlformats.org/drawingml/2006/picture" xmlns:a14="http://schemas.microsoft.com/office/drawing/2010/main">
+          <mc:Fallback xmlns:a14="http://schemas.microsoft.com/office/drawing/2010/main" xmlns:pic="http://schemas.openxmlformats.org/drawingml/2006/picture" xmlns:a="http://schemas.openxmlformats.org/drawingml/2006/main">
             <w:pict w14:anchorId="5EDEA3CE">
               <v:shape id="Graphic 1" style="position:absolute;margin-left:1.3pt;margin-top:250.95pt;width:395.45pt;height:592.5pt;flip:x;z-index:-251658240;visibility:visible;mso-wrap-style:square;mso-width-percent:0;mso-height-percent:0;mso-wrap-distance-left:9pt;mso-wrap-distance-top:0;mso-wrap-distance-right:9pt;mso-wrap-distance-bottom:0;mso-position-horizontal:absolute;mso-position-horizontal-relative:text;mso-position-vertical:absolute;mso-position-vertical-relative:page;mso-width-percent:0;mso-height-percent:0;mso-width-relative:margin;mso-height-relative:margin;v-text-anchor:middle" coordsize="4900017,7340636" o:spid="_x0000_s1026" fillcolor="#0070ad" stroked="f" strokeweight=".44156mm" path="m,7340637l955,2956402c1273,1717473,898204,660762,2120583,458969l4900018,r,7340637l,7340637xe" o:gfxdata="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" w14:anchorId="2AAB5018">
                 <v:stroke joinstyle="miter"/>
@@ -12886,7 +13399,7 @@
                     <pic:cNvPicPr/>
                   </pic:nvPicPr>
                   <pic:blipFill>
-                    <a:blip r:embed="rId20">
+                    <a:blip r:embed="rId18">
                       <a:extLst>
                         <a:ext uri="{28A0092B-C50C-407E-A947-70E740481C1C}">
                           <a14:useLocalDpi xmlns:a14="http://schemas.microsoft.com/office/drawing/2010/main" val="0"/>
@@ -12918,12 +13431,21 @@
         </w:drawing>
       </w:r>
       <w:r>
+        <w:rPr>
+          <w:lang w:val="nl-NL"/>
+        </w:rPr>
         <w:t>Ab</w:t>
       </w:r>
       <w:r>
+        <w:rPr>
+          <w:lang w:val="nl-NL"/>
+        </w:rPr>
         <w:t xml:space="preserve">out </w:t>
       </w:r>
       <w:r>
+        <w:rPr>
+          <w:lang w:val="nl-NL"/>
+        </w:rPr>
         <w:t>Sogeti</w:t>
       </w:r>
     </w:p>
@@ -12936,14 +13458,14 @@
         <w:rPr>
           <w:rFonts w:ascii="Ubuntu Light" w:hAnsi="Ubuntu Light"/>
           <w:noProof/>
-          <w:lang w:val="en-US"/>
+          <w:lang w:val="nl-NL"/>
         </w:rPr>
       </w:pPr>
       <w:r>
         <w:rPr>
           <w:rFonts w:ascii="Ubuntu Light" w:hAnsi="Ubuntu Light"/>
           <w:noProof/>
-          <w:lang w:val="en-US"/>
+          <w:lang w:val="nl-NL"/>
         </w:rPr>
         <w:t>Part of the Capgemini Group, Sogeti makes business value through technology for organizations that need to implement innovation at speed and want a local partner with global scale. With a hands</w:t>
       </w:r>
@@ -12951,7 +13473,7 @@
         <w:rPr>
           <w:rFonts w:ascii="Ubuntu Light" w:hAnsi="Ubuntu Light"/>
           <w:noProof/>
-          <w:lang w:val="en-US"/>
+          <w:lang w:val="nl-NL"/>
         </w:rPr>
         <w:t xml:space="preserve"> </w:t>
       </w:r>
@@ -12959,7 +13481,7 @@
         <w:rPr>
           <w:rFonts w:ascii="Ubuntu Light" w:hAnsi="Ubuntu Light"/>
           <w:noProof/>
-          <w:lang w:val="en-US"/>
+          <w:lang w:val="nl-NL"/>
         </w:rPr>
         <w:t xml:space="preserve">on culture and close proximity to its clients, Sogeti implements solutions that will help organizations work faster, better, and smarter. By combining its agility and speed of implementation through a DevOps approach, Sogeti delivers innovative solutions in quality engineering, cloud and application development, all driven by AI, data </w:t>
       </w:r>
@@ -12967,7 +13489,7 @@
         <w:rPr>
           <w:rFonts w:ascii="Ubuntu Light" w:hAnsi="Ubuntu Light"/>
           <w:noProof/>
-          <w:lang w:val="en-US"/>
+          <w:lang w:val="nl-NL"/>
         </w:rPr>
         <w:br/>
         <w:t>and automation.</w:t>
@@ -12982,14 +13504,14 @@
         <w:rPr>
           <w:rFonts w:ascii="Ubuntu Light" w:hAnsi="Ubuntu Light"/>
           <w:noProof/>
-          <w:lang w:val="en-US"/>
+          <w:lang w:val="nl-NL"/>
         </w:rPr>
       </w:pPr>
       <w:r>
         <w:rPr>
           <w:rFonts w:ascii="Ubuntu Light" w:hAnsi="Ubuntu Light"/>
           <w:noProof/>
-          <w:lang w:val="en-US"/>
+          <w:lang w:val="nl-NL"/>
         </w:rPr>
         <w:t>Capgemini is a global business and technology transformation partner, helping organizations to accelerate their dual transition to a digital and sustainable world, while creating tangible impact for enterprises and society. It is a responsible and diverse group of 340,000 team members in more than 50 countries. With its strong over 55</w:t>
       </w:r>
@@ -12997,7 +13519,7 @@
         <w:rPr>
           <w:rFonts w:ascii="Ubuntu Light" w:hAnsi="Ubuntu Light"/>
           <w:noProof/>
-          <w:lang w:val="en-US"/>
+          <w:lang w:val="nl-NL"/>
         </w:rPr>
         <w:t xml:space="preserve"> </w:t>
       </w:r>
@@ -13005,7 +13527,7 @@
         <w:rPr>
           <w:rFonts w:ascii="Ubuntu Light" w:hAnsi="Ubuntu Light"/>
           <w:noProof/>
-          <w:lang w:val="en-US"/>
+          <w:lang w:val="nl-NL"/>
         </w:rPr>
         <w:t>year heritage, Capgemini is trusted by its clients to unlock the value of technology to address the entire breadth of their business needs. It delivers end</w:t>
       </w:r>
@@ -13013,7 +13535,7 @@
         <w:rPr>
           <w:rFonts w:ascii="Ubuntu Light" w:hAnsi="Ubuntu Light"/>
           <w:noProof/>
-          <w:lang w:val="en-US"/>
+          <w:lang w:val="nl-NL"/>
         </w:rPr>
         <w:t xml:space="preserve"> </w:t>
       </w:r>
@@ -13021,7 +13543,7 @@
         <w:rPr>
           <w:rFonts w:ascii="Ubuntu Light" w:hAnsi="Ubuntu Light"/>
           <w:noProof/>
-          <w:lang w:val="en-US"/>
+          <w:lang w:val="nl-NL"/>
         </w:rPr>
         <w:t>to</w:t>
       </w:r>
@@ -13029,7 +13551,7 @@
         <w:rPr>
           <w:rFonts w:ascii="Ubuntu Light" w:hAnsi="Ubuntu Light"/>
           <w:noProof/>
-          <w:lang w:val="en-US"/>
+          <w:lang w:val="nl-NL"/>
         </w:rPr>
         <w:t xml:space="preserve"> </w:t>
       </w:r>
@@ -13037,7 +13559,7 @@
         <w:rPr>
           <w:rFonts w:ascii="Ubuntu Light" w:hAnsi="Ubuntu Light"/>
           <w:noProof/>
-          <w:lang w:val="en-US"/>
+          <w:lang w:val="nl-NL"/>
         </w:rPr>
         <w:t>end services and solutions leveraging strengths from strategy and design to engineering, all fueled by its market leading capabilities in AI, generative AI, cloud and data, combined with its deep industry expertise and partner ecosystem. The Group reported 2024 global revenues of €22.1 billion.</w:t>
       </w:r>
@@ -13045,7 +13567,7 @@
         <w:rPr>
           <w:rFonts w:ascii="Ubuntu Light" w:hAnsi="Ubuntu Light"/>
           <w:noProof/>
-          <w:lang w:val="en-US"/>
+          <w:lang w:val="nl-NL"/>
         </w:rPr>
         <w:t xml:space="preserve"> </w:t>
       </w:r>
@@ -13057,7 +13579,7 @@
         <w:jc w:val="left"/>
         <w:rPr>
           <w:noProof/>
-          <w:lang w:val="en-US"/>
+          <w:lang w:val="nl-NL"/>
         </w:rPr>
       </w:pPr>
       <w:r>
@@ -13066,7 +13588,7 @@
           <w:noProof/>
           <w:sz w:val="22"/>
           <w:szCs w:val="22"/>
-          <w:lang w:val="en-US"/>
+          <w:lang w:val="nl-NL"/>
         </w:rPr>
         <w:t>Visit</w:t>
       </w:r>
@@ -13076,7 +13598,7 @@
           <w:noProof/>
           <w:sz w:val="22"/>
           <w:szCs w:val="22"/>
-          <w:lang w:val="en-US"/>
+          <w:lang w:val="nl-NL"/>
         </w:rPr>
         <w:t xml:space="preserve"> us at</w:t>
       </w:r>
@@ -13086,11 +13608,11 @@
           <w:noProof/>
           <w:sz w:val="22"/>
           <w:szCs w:val="22"/>
-          <w:lang w:val="en-US"/>
+          <w:lang w:val="nl-NL"/>
         </w:rPr>
         <w:t xml:space="preserve"> </w:t>
       </w:r>
-      <w:hyperlink r:id="rId21" w:history="1">
+      <w:hyperlink r:id="rId19" w:history="1">
         <w:r>
           <w:rPr>
             <w:rStyle w:val="Hyperlink"/>
@@ -13099,7 +13621,7 @@
             <w:color w:val="FFFFFF" w:themeColor="background1"/>
             <w:sz w:val="22"/>
             <w:szCs w:val="22"/>
-            <w:lang w:val="en-US"/>
+            <w:lang w:val="nl-NL"/>
           </w:rPr>
           <w:t>www.sogeti.com</w:t>
         </w:r>
@@ -13112,15 +13634,14 @@
         <w:rPr>
           <w:noProof/>
           <w:sz w:val="24"/>
-          <w:lang w:val="en-US"/>
         </w:rPr>
       </w:pPr>
     </w:p>
     <w:sectPr>
-      <w:headerReference w:type="default" r:id="rId22"/>
-      <w:footerReference w:type="default" r:id="rId23"/>
-      <w:headerReference w:type="first" r:id="rId24"/>
-      <w:footerReference w:type="first" r:id="rId25"/>
+      <w:headerReference w:type="default" r:id="rId20"/>
+      <w:footerReference w:type="default" r:id="rId21"/>
+      <w:headerReference w:type="first" r:id="rId22"/>
+      <w:footerReference w:type="first" r:id="rId23"/>
       <w:pgSz w:w="11909" w:h="16834" w:code="9"/>
       <w:pgMar w:top="1134" w:right="851" w:bottom="1043" w:left="851" w:header="720" w:footer="1077" w:gutter="0"/>
       <w:cols w:space="720"/>
@@ -19986,6 +20507,7 @@
     <w:rsid w:val="00F1778E"/>
     <w:rsid w:val="00F5622E"/>
     <w:rsid w:val="00FD4FAA"/>
+    <w:rsid w:val="00FE0D75"/>
     <w:rsid w:val="00FE33AC"/>
   </w:rsids>
   <m:mathPr>
@@ -20681,57 +21203,6 @@
 </file>
 
 <file path=customXml/item1.xml><?xml version="1.0" encoding="utf-8"?>
-<p:properties xmlns:p="http://schemas.microsoft.com/office/2006/metadata/properties" xmlns:xsi="http://www.w3.org/2001/XMLSchema-instance" xmlns:pc="http://schemas.microsoft.com/office/infopath/2007/PartnerControls">
-  <documentManagement/>
-</p:properties>
-</file>
-
-<file path=customXml/item2.xml><?xml version="1.0" encoding="utf-8"?>
-<?mso-contentType ?>
-<FormTemplates xmlns="http://schemas.microsoft.com/sharepoint/v3/contenttype/forms">
-  <Display>DocumentLibraryForm</Display>
-  <Edit>DocumentLibraryForm</Edit>
-  <New>DocumentLibraryForm</New>
-</FormTemplates>
-</file>
-
-<file path=customXml/item3.xml><?xml version="1.0" encoding="utf-8"?>
-<b:Sources xmlns:b="http://schemas.openxmlformats.org/officeDocument/2006/bibliography" xmlns="http://schemas.openxmlformats.org/officeDocument/2006/bibliography" SelectedStyle="\APASixthEditionOfficeOnline.xsl" StyleName="APA" Version="6">
-  <b:Source>
-    <b:Tag>Str</b:Tag>
-    <b:SourceType>InternetSite</b:SourceType>
-    <b:Guid>{858EA4A0-FB82-4B20-B9B2-07FE3B095505}</b:Guid>
-    <b:Title>Change Data Capture (CDC) in Snowflake: Challenges, Methods, and Best Practices</b:Title>
-    <b:Author>
-      <b:Author>
-        <b:Corporate>Striim Team</b:Corporate>
-      </b:Author>
-    </b:Author>
-    <b:InternetSiteTitle>Striim</b:InternetSiteTitle>
-    <b:URL>https://www.striim.com/blog/cdc-to-snowflake/</b:URL>
-    <b:RefOrder>1</b:RefOrder>
-  </b:Source>
-  <b:Source>
-    <b:Tag>TMA25</b:Tag>
-    <b:SourceType>InternetSite</b:SourceType>
-    <b:Guid>{3BCE5496-0798-400B-AB16-2031BF0EA150}</b:Guid>
-    <b:Author>
-      <b:Author>
-        <b:Corporate>TMAP</b:Corporate>
-      </b:Author>
-    </b:Author>
-    <b:Title>Data Quality</b:Title>
-    <b:InternetSiteTitle>TMAP</b:InternetSiteTitle>
-    <b:Year>2025</b:Year>
-    <b:Month>augustus</b:Month>
-    <b:Day>11</b:Day>
-    <b:URL>https://www.tmap.net/building-blocks/data-quality/</b:URL>
-    <b:RefOrder>2</b:RefOrder>
-  </b:Source>
-</b:Sources>
-</file>
-
-<file path=customXml/item4.xml><?xml version="1.0" encoding="utf-8"?>
 <ct:contentTypeSchema xmlns:ct="http://schemas.microsoft.com/office/2006/metadata/contentType" xmlns:ma="http://schemas.microsoft.com/office/2006/metadata/properties/metaAttributes" ct:_="" ma:_="" ma:contentTypeName="Document" ma:contentTypeID="0x010100085AFD7B419CCB4D976809A25AC12EA7" ma:contentTypeVersion="3" ma:contentTypeDescription="Create a new document." ma:contentTypeScope="" ma:versionID="5c6d5587ff30485043841eb520911e53">
   <xsd:schema xmlns:xsd="http://www.w3.org/2001/XMLSchema" xmlns:xs="http://www.w3.org/2001/XMLSchema" xmlns:p="http://schemas.microsoft.com/office/2006/metadata/properties" xmlns:ns2="208433f9-44af-4384-9888-a0adb91d42f7" targetNamespace="http://schemas.microsoft.com/office/2006/metadata/properties" ma:root="true" ma:fieldsID="0b6324f69be3d9ec028f891e55893e39" ns2:_="">
     <xsd:import namespace="208433f9-44af-4384-9888-a0adb91d42f7"/>
@@ -20869,32 +21340,72 @@
 </ct:contentTypeSchema>
 </file>
 
-<file path=customXml/itemProps1.xml><?xml version="1.0" encoding="utf-8"?>
-<ds:datastoreItem xmlns:ds="http://schemas.openxmlformats.org/officeDocument/2006/customXml" ds:itemID="{AB6B651F-F351-4577-BB7B-D367D66BD37C}">
-  <ds:schemaRefs>
-    <ds:schemaRef ds:uri="http://schemas.microsoft.com/office/2006/metadata/properties"/>
-    <ds:schemaRef ds:uri="http://schemas.microsoft.com/office/infopath/2007/PartnerControls"/>
-  </ds:schemaRefs>
-</ds:datastoreItem>
+<file path=customXml/item2.xml><?xml version="1.0" encoding="utf-8"?>
+<?mso-contentType ?>
+<FormTemplates xmlns="http://schemas.microsoft.com/sharepoint/v3/contenttype/forms">
+  <Display>DocumentLibraryForm</Display>
+  <Edit>DocumentLibraryForm</Edit>
+  <New>DocumentLibraryForm</New>
+</FormTemplates>
 </file>
 
-<file path=customXml/itemProps2.xml><?xml version="1.0" encoding="utf-8"?>
-<ds:datastoreItem xmlns:ds="http://schemas.openxmlformats.org/officeDocument/2006/customXml" ds:itemID="{127A1799-7F25-4A2F-8DCF-045B5E87FD7F}">
-  <ds:schemaRefs>
-    <ds:schemaRef ds:uri="http://schemas.microsoft.com/sharepoint/v3/contenttype/forms"/>
-  </ds:schemaRefs>
-</ds:datastoreItem>
+<file path=customXml/item3.xml><?xml version="1.0" encoding="utf-8"?>
+<p:properties xmlns:p="http://schemas.microsoft.com/office/2006/metadata/properties" xmlns:xsi="http://www.w3.org/2001/XMLSchema-instance" xmlns:pc="http://schemas.microsoft.com/office/infopath/2007/PartnerControls">
+  <documentManagement/>
+</p:properties>
 </file>
 
-<file path=customXml/itemProps3.xml><?xml version="1.0" encoding="utf-8"?>
-<ds:datastoreItem xmlns:ds="http://schemas.openxmlformats.org/officeDocument/2006/customXml" ds:itemID="{B520DA52-F75E-43AF-AF81-B86AD2505D24}">
-  <ds:schemaRefs>
-    <ds:schemaRef ds:uri="http://schemas.openxmlformats.org/officeDocument/2006/bibliography"/>
-  </ds:schemaRefs>
-</ds:datastoreItem>
+<file path=customXml/item4.xml><?xml version="1.0" encoding="utf-8"?>
+<b:Sources xmlns:b="http://schemas.openxmlformats.org/officeDocument/2006/bibliography" xmlns="http://schemas.openxmlformats.org/officeDocument/2006/bibliography" SelectedStyle="\APASixthEditionOfficeOnline.xsl" StyleName="APA" Version="6">
+  <b:Source>
+    <b:Tag>Str</b:Tag>
+    <b:SourceType>InternetSite</b:SourceType>
+    <b:Guid>{858EA4A0-FB82-4B20-B9B2-07FE3B095505}</b:Guid>
+    <b:Title>Change Data Capture (CDC) in Snowflake: Challenges, Methods, and Best Practices</b:Title>
+    <b:Author>
+      <b:Author>
+        <b:Corporate>Striim Team</b:Corporate>
+      </b:Author>
+    </b:Author>
+    <b:InternetSiteTitle>Striim</b:InternetSiteTitle>
+    <b:URL>https://www.striim.com/blog/cdc-to-snowflake/</b:URL>
+    <b:RefOrder>1</b:RefOrder>
+  </b:Source>
+  <b:Source>
+    <b:Tag>TMA25</b:Tag>
+    <b:SourceType>InternetSite</b:SourceType>
+    <b:Guid>{3BCE5496-0798-400B-AB16-2031BF0EA150}</b:Guid>
+    <b:Author>
+      <b:Author>
+        <b:Corporate>TMAP</b:Corporate>
+      </b:Author>
+    </b:Author>
+    <b:Title>Data Quality</b:Title>
+    <b:InternetSiteTitle>TMAP</b:InternetSiteTitle>
+    <b:Year>2025</b:Year>
+    <b:Month>augustus</b:Month>
+    <b:Day>11</b:Day>
+    <b:URL>https://www.tmap.net/building-blocks/data-quality/</b:URL>
+    <b:RefOrder>2</b:RefOrder>
+  </b:Source>
+  <b:Source>
+    <b:Tag>TMA1</b:Tag>
+    <b:SourceType>InternetSite</b:SourceType>
+    <b:Guid>{E06EA766-634A-4A1C-BB7B-8BE2377EAD64}</b:Guid>
+    <b:Author>
+      <b:Author>
+        <b:Corporate>TMAP</b:Corporate>
+      </b:Author>
+    </b:Author>
+    <b:Title>Performance testing</b:Title>
+    <b:InternetSiteTitle>TMAP</b:InternetSiteTitle>
+    <b:URL>https://www.tmap.net/building-blocks/performance-testing/</b:URL>
+    <b:RefOrder>3</b:RefOrder>
+  </b:Source>
+</b:Sources>
 </file>
 
-<file path=customXml/itemProps4.xml><?xml version="1.0" encoding="utf-8"?>
+<file path=customXml/itemProps1.xml><?xml version="1.0" encoding="utf-8"?>
 <ds:datastoreItem xmlns:ds="http://schemas.openxmlformats.org/officeDocument/2006/customXml" ds:itemID="{9588FA47-DF96-4027-BE97-B34D30F6DC3D}">
   <ds:schemaRefs>
     <ds:schemaRef ds:uri="http://schemas.microsoft.com/office/2006/metadata/contentType"/>
@@ -20912,6 +21423,31 @@
 </ds:datastoreItem>
 </file>
 
+<file path=customXml/itemProps2.xml><?xml version="1.0" encoding="utf-8"?>
+<ds:datastoreItem xmlns:ds="http://schemas.openxmlformats.org/officeDocument/2006/customXml" ds:itemID="{127A1799-7F25-4A2F-8DCF-045B5E87FD7F}">
+  <ds:schemaRefs>
+    <ds:schemaRef ds:uri="http://schemas.microsoft.com/sharepoint/v3/contenttype/forms"/>
+  </ds:schemaRefs>
+</ds:datastoreItem>
+</file>
+
+<file path=customXml/itemProps3.xml><?xml version="1.0" encoding="utf-8"?>
+<ds:datastoreItem xmlns:ds="http://schemas.openxmlformats.org/officeDocument/2006/customXml" ds:itemID="{AB6B651F-F351-4577-BB7B-D367D66BD37C}">
+  <ds:schemaRefs>
+    <ds:schemaRef ds:uri="http://schemas.microsoft.com/office/2006/metadata/properties"/>
+    <ds:schemaRef ds:uri="http://schemas.microsoft.com/office/infopath/2007/PartnerControls"/>
+  </ds:schemaRefs>
+</ds:datastoreItem>
+</file>
+
+<file path=customXml/itemProps4.xml><?xml version="1.0" encoding="utf-8"?>
+<ds:datastoreItem xmlns:ds="http://schemas.openxmlformats.org/officeDocument/2006/customXml" ds:itemID="{7714392D-D7D3-4811-9F9C-DCEE5945F1C9}">
+  <ds:schemaRefs>
+    <ds:schemaRef ds:uri="http://schemas.openxmlformats.org/officeDocument/2006/bibliography"/>
+  </ds:schemaRefs>
+</ds:datastoreItem>
+</file>
+
 <file path=docMetadata/LabelInfo.xml><?xml version="1.0" encoding="utf-8"?>
 <clbl:labelList xmlns:clbl="http://schemas.microsoft.com/office/2020/mipLabelMetadata">
   <clbl:label id="{bb5d96ea-ab39-44a0-a6d6-b6f0aac5958b}" enabled="1" method="Privileged" siteId="{76a2ae5a-9f00-4f6b-95ed-5d33d77c4d61}" removed="0"/>

</xml_diff>